<commit_message>
Publish the Paper 1 manuscript built after the controls landed
Regenerated after the sixteen supplied controls entered the corpus: English and
Ukrainian, 7 428 words, 32 claims, 17 citations. The thirteen markers are all in
Section 7.8 and are the literature gate refusing to assert what retrieval has
not yet supported.

Also refreshed by the same run: the acceptance gate, the exploratory gap and
literature matrices, the open-items lists and the retrieval manifest.

Co-Authored-By: Claude Opus 5 <noreply@anthropic.com>
Claude-Session: https://claude.ai/code/session_01Bxcmh7mp8eEyvNJaWTyhdD
</commit_message>
<xml_diff>
--- a/paper_3_audit/paper1_manuscript_uk.docx
+++ b/paper_3_audit/paper1_manuscript_uk.docx
@@ -42,10 +42,10 @@
         <w:rPr>
           <w:b/>
         </w:rPr>
-        <w:t>Methods.</w:t>
-      </w:r>
-      <w:r>
-        <w:t xml:space="preserve"> Сім гідрологічних постів, лазерна альтиметрія ICESat-2 ATL13 , радарна інтерферометрія SWOT PIXC/RiverSP та архівна навігаційна карта узгоджені до нормальних висот EVRF2019  через квазігеоїд EGG2015  та операцію EPSG:9902 , при цьому конвенція постійного припливу кожного продукту врахована явно. Поздовжні ухили водної поверхні для кожного прольоту оцінюються за допомогою стійкого (оцінювач Тейла–Сена) підгону, де один проліт є незалежною одиницею спостереження. Дно реконструюється за даними промірів глибин виключно в межах просторової блокової крос-валідації та перевіряється на відповідність історичній статистиці спрацювання та оголення дна.</w:t>
+        <w:t>Метод.</w:t>
+      </w:r>
+      <w:r>
+        <w:t xml:space="preserve"> Сім гідрологічних постів, лазерна альтиметрія ICESat-2 ATL13 , радарна інтерферометрія SWOT PIXC/RiverSP та архівна навігаційна карта узгоджені в нормальні висоти EVRF2019  через квазігеоїд EGG2015  та операцію EPSG:9902 , при цьому конвенція постійного припливу кожного продукту врахована явно. Поздовжні ухили водної поверхні для кожного прольоту оцінюються за допомогою надійного (оцінювач Тейла–Сена) підгону, де один проліт є незалежною одиницею спостереження. Система перевіряється перед використанням: відносно гідрологічних постів, між двома супутниками та відносно польової зйомки 1970  тієї самої водної поверхні.</w:t>
       </w:r>
     </w:p>
     <w:p>
@@ -53,14 +53,50 @@
         <w:spacing w:line="360" w:lineRule="auto"/>
         <w:jc w:val="both"/>
       </w:pPr>
+      <w:r>
+        <w:t xml:space="preserve">&gt; </w:t>
+      </w:r>
       <w:r>
         <w:rPr>
           <w:b/>
         </w:rPr>
-        <w:t>Результати.</w:t>
-      </w:r>
-      <w:r>
-        <w:t xml:space="preserve"> У межах колишньої площі водосховища ухил водної поверхні на один проліт змінився з медіани Тейла–Сена +0.090 cm/km до +3.314 cm/km; різниця +3.223 cm/km (95 % CI 95% CI [+1.994, +5.071] см/км; перестановочний тест p = 1.00e-04; тест Манна–Вітні p = 3.92e-05; додатні ухили до 10/14  (знаковий тест p = 0.180) проти після 14/14  (p = 1.22e-04)), а неоднорідність висоти водної поверхні в межах прольоту зросла з 0.117 m до 0.397 m, різниця +0.280 m. Реконструкція дна лише за даними промірів глибин відтворює історичне оголене дно внаслідок спрацювання (усе закартоване водосховище: історичне 12.9% проти реконструйованого 12.77% (різниця -0.18 pp)), а в зонах нижче за течією інтерполяція лише за даними промірів глибин перевершує будь-який варіант з обмеженням береговою лінією (SND_ONLY / LINEAR: СКП (RMSE) 2.20 m, зміщення -0.07 m, NMAD 1.24 m).</w:t>
+        <w:t>[PENDING OPEN91]</w:t>
+      </w:r>
+      <w:r>
+        <w:t xml:space="preserve"> translation rejected: locked tokens did not round-trip; English kept</w:t>
+      </w:r>
+    </w:p>
+    <w:p>
+      <w:pPr>
+        <w:spacing w:line="360" w:lineRule="auto"/>
+        <w:jc w:val="both"/>
+      </w:pPr>
+      <w:r>
+        <w:t>&gt; `section: paragraph 4` · `status: blocked`</w:t>
+      </w:r>
+    </w:p>
+    <w:p>
+      <w:pPr>
+        <w:spacing w:line="360" w:lineRule="auto"/>
+        <w:jc w:val="both"/>
+      </w:pPr>
+      <w:r>
+        <w:t>&gt; `blocks_submission: yes`</w:t>
+      </w:r>
+    </w:p>
+    <w:p>
+      <w:pPr>
+        <w:spacing w:line="360" w:lineRule="auto"/>
+        <w:jc w:val="both"/>
+      </w:pPr>
+      <w:r>
+        <w:rPr>
+          <w:b/>
+        </w:rPr>
+        <w:t>Results.</w:t>
+      </w:r>
+      <w:r>
+        <w:t xml:space="preserve"> Within the former reservoir footprint the per-overpass slope changed from Theil-Sen median +0.090 cm/km pre -&gt; +3.314 cm/km post; difference +3.223 cm/km (95 % CI 95% CI [+1.994, +5.071] cm/km; permutation p = 1.00e-04; Mann-Whitney p = 3.92e-05; positive slopes pre 10/14 (sign test p = 0.180) vs post 14/14 (p = 1.22e-04)), and within-overpass water-surface heterogeneity rose from 0.117 m -&gt; 0.397 m, difference +0.280 m. The fast-sampling SWOT orbit recorded the outlet through the drawdown itself: outlet 5.63 m EVRF2019 on 13 June, from 17.53 m on 31 May.</w:t>
       </w:r>
     </w:p>
     <w:p>
@@ -75,7 +111,7 @@
         <w:t>Висновки.</w:t>
       </w:r>
       <w:r>
-        <w:t xml:space="preserve"> Каховське водосховище не просто скоротилося: його водна поверхня набула стійкого поздовжнього градієнта в напрямку нижнього Дніпра, а його дно було реконструйовано та валідовано відносно гідрографії проєктної епохи в тій самій вертикальній системі відліку. Кожне твердження ґрунтується на виміряній величині із зазначеною невизначеністю; там, де величину неможливо виміряти наявними даними — закон залежності ухилу водної поверхні від витрати води після прориву греблі, швидкість зміни дна — у рукописі про це зазначено прямо, замість того щоб робити припущення. Реконструйоване дно оприлюднюється як вхідні дані про рельєф для супровідної статті щодо гідравлічних наслідків трансформації поверхні.</w:t>
+        <w:t xml:space="preserve"> Водосховище не просто зменшилося: його водна поверхня набула стійкого градієнта в напрямку вниз за течією, який можна виміряти лише після зведення чотирьох поверхонь, що мають різні системи відліку, до однієї системи. Кожне твердження ґрунтується на виміряній величині із зазначеною невизначеністю; там, де величину неможливо виміряти наявними даними — закон залежності ухилу від витрати води після прориву греблі, швидкість зміни дна — у рукописі зазначено це, а не зроблено припущення. Дно, по якому тепер проходить ця поверхня, реконструйовано в супровідній статті (Paper 2), а наслідки для шорсткості та пропускної здатності — у двох наступних.</w:t>
       </w:r>
     </w:p>
     <w:p>
@@ -90,7 +126,7 @@
         <w:t>Ключові слова:</w:t>
       </w:r>
       <w:r>
-        <w:t xml:space="preserve"> супутникова альтиметрія; ICESat-2; SWOT; вертикальна система відліку; EVRF2019; спрацювання водосховища; реконструкція дна; застаріла батиметрія; Каховське водосховище</w:t>
+        <w:t xml:space="preserve"> супутникова альтиметрія; ICESat-2; SWOT; ухил водної поверхні; вертикальна система відліку; EVRF2019; прорив греблі; спрацювання водосховища; гідравлічний режим; Каховське водосховище</w:t>
       </w:r>
     </w:p>
     <w:p>
@@ -237,7 +273,7 @@
         <w:jc w:val="both"/>
       </w:pPr>
       <w:r>
-        <w:t>У цій статті розглядаються три питання. (i) Чи змінився гідравлічний режим водної поверхні в межах колишнього Каховського водосховища і чи зберігається ця зміна? (ii) Чи можна спільно використовувати дані SWOT та ICESat-2  після гармонізації їхніх вертикальних систем відліку? (iii) Чи обмежують застарілі гідрографічні дані як поверхню до прориву греблі, так і реконструйоване дно, і наскільки точним є це дно? Там, де дані не дають відповіді — співвідношення ухил водної поверхні–витрата води після прориву греблі, швидкість зміни дна — у статті зазначається обмеження замість виведення відповіді. Те, що нова геометрія та поверхня, яка заростає рослинністю, означають для коефіцієнта шорсткості Маннінга (n), пропускної здатності та рівня води, є предметом супровідної статті, у якій реконструйоване тут дно використовується як вхідні дані про рельєф.</w:t>
+        <w:t>У цій статті розглядаються три питання. (i) Чи можна звести дані гідрологічних постів, двох супутникових альтиметрів та архівних гідрографічних зйомок до єдиної вертикальної системи відліку з достатньою точністю, щоб після редукції зберігся градієнт порядку сантиметра на кілометр? (ii) Якщо це вдалося, чи змінився гідравлічний режим водної поверхні в межах колишнього водосховища і чи зберігається ця зміна після завершення перехідного процесу спрацювання? (iii) Чи підтверджують історичні дані незалежно стан наповнення, зафіксований супутниками до прориву греблі? Там, де дані не дозволяють отримати відповідь — зокрема щодо залежності ухилу від витрати води після прориву греблі, — у статті вказується обмеження замість виведення відповіді. Дно під цією поверхнею реконструйовано в супутній статті (Paper 2); значення геометрії та рослинного покриву для коефіцієнта шорсткості Маннінга (n) та пропускної здатності є предметом двох наступних робіт.</w:t>
       </w:r>
     </w:p>
     <w:p>
@@ -330,7 +366,7 @@
         <w:rPr>
           <w:b/>
         </w:rPr>
-        <w:t>[PENDING OPEN91]</w:t>
+        <w:t>[PENDING OPEN92]</w:t>
       </w:r>
       <w:r>
         <w:t xml:space="preserve"> translation rejected: locked tokens did not round-trip; English kept</w:t>
@@ -411,7 +447,7 @@
         <w:jc w:val="both"/>
       </w:pPr>
       <w:r>
-        <w:t>Знімки Sentinel-2 L2A, оброблені на сітці реєстру 20 m (EPSG:32636) із застосуванням адитивного зміщення BOA, забезпечують маски води з порогом покриття для аналізу планової конфігурації (розділ 4.7) та контури берегової лінії, що використовуються для перевірки реконструкції дна; 53 dates охоплюють колишню акваторію. Повна класифікація поверхні та маски Sentinel-1 m є предметом супровідної статті.</w:t>
+        <w:t>Сцени Sentinel-2 L2A, оброблені на сітці реєстру 20 m (EPSG:32636) із застосуванням адитивного зміщення BOA, забезпечують маски води з порогом покриття для аналізу планової конфігурації (розділ 4.6); 53 dates охоплюють колишню акваторію. Повна класифікація поверхні, маски Sentinel-1 m та керована робота із затоплення належать до статті 3.</w:t>
       </w:r>
     </w:p>
     <w:p>
@@ -428,7 +464,7 @@
         <w:jc w:val="both"/>
       </w:pPr>
       <w:r>
-        <w:t>Вісім сфотографованих сторінок монографії про Дніпровські водосховища (Таблиці 19–21, , Рисунки 13–16) та проміри глибин на картах 7 514 S-57 є історичними джерелами; епоха зйомки промірів не зафіксована, що є обмеженням, яке унеможливлює визначення будь-якої швидкості зміни дна (відсутність епохи). Який рівень редукції мають ці проміри, у джерелі не зазначено і встановлюється у Розділі 5.7..</w:t>
+        <w:t>Вісім сфотографованих сторінок монографії про дніпровські водосховища (Таблиці 19–21, , Рисунки 13–16) містять проектні значення та 1970 зйомку поздовжнього профілю вільної поверхні, що використовуються тут як незалежна перевірка. 7 514 Картографічні проміри глибин є предметом статті про реконструкцію дна (Стаття 2); у цій статті вони використовуються лише для встановлення того, до якого рівня редукції вони приведені (Розділ 5.7).</w:t>
       </w:r>
     </w:p>
     <w:p>
@@ -445,7 +481,7 @@
         <w:jc w:val="both"/>
       </w:pPr>
       <w:r>
-        <w:t>офіційна корекція на постах 0.216 m Сітка квазігеоїда EGG2015 , що використовується для гілок ICESat-2  та SWOT, є растром 1′×1′, походження якого обговорюється в Розділі 7.9.</w:t>
+        <w:t>Для всієї території використовується одна трансформаційна сітка виробництва `ua_2019z.asc`, розподіл CRS-EU операції EPSG:9902 ; при вибірці на естуарних постах вона дає офіційну поправку на постах 0.216 m. Квазігеоїд EGG2015 , що використовується для гілок ICESat-2  та SWOT, є растром 7 200 × 3 600  з роздільною здатністю 1′ × 1′, який охоплює 50° зх. д. – 70° сх. д. та 25° пн. ш. – 85° пн. ш., що відповідає заявленій геометрії повнорозмірного продукту EGG2015 ; запис про отримання та ліцензію цієї конкретної копії відновити не вдалося (розділ 7.9).</w:t>
       </w:r>
     </w:p>
     <w:p>
@@ -503,19 +539,28 @@
     </w:p>
     <w:p>
       <w:pPr>
-        <w:pStyle w:val="Heading1"/>
-      </w:pPr>
-      <w:r>
-        <w:t>4.1 Vertical harmonisation: the four surfaces</w:t>
+        <w:spacing w:line="360" w:lineRule="auto"/>
+        <w:jc w:val="both"/>
+      </w:pPr>
+      <w:r>
+        <w:t>Гармонізація розділу 4.1  є методом цієї статті, а не підготовкою до нього: поправки між чотирма поверхнями мають той самий порядок, що й шуканий гідравлічний сигнал, тому результат існує лише за умови існування системи відліку. Отже, у розділі 5  система відліку тестується перед тим, як розділ 6  її використовує.</w:t>
       </w:r>
     </w:p>
     <w:p>
       <w:pPr>
+        <w:pStyle w:val="Heading1"/>
+      </w:pPr>
+      <w:r>
+        <w:t>4.1 Vertical harmonisation: the four surfaces</w:t>
+      </w:r>
+    </w:p>
+    <w:p>
+      <w:pPr>
         <w:spacing w:line="360" w:lineRule="auto"/>
         <w:jc w:val="both"/>
       </w:pPr>
       <w:r>
-        <w:t>Рівні води на гідрологічних постах перераховуються у нормальні висоти EVRF2019  за допомогою офіційної операції EPSG:9902 , вибірка якої здійснюється з виробничої сітки на кожній станції (трансформовані 10,194 dенні значення); зміщення просторово варіюється від 0.1715  до 0.2157 m, тому жодна єдина національна константа не є прийнятною. Висоти ICESat-2 ATL13 h редукуються за допомогою квазігеоїда EGG2015  після додавання терміна ATL03  для переходу від безприпливної до середньоприпливної системи, що зміщує коректор шести станцій на . Висоти SWOT PIXC редукуються шляхом віднімання припливів твердої Землі, навантажувальних та полюсних припливів, які надаються у продукті, але не застосовуються, і ніколи не віднімаються від поля геоїда, а потім — за допомогою того самого квазігеоїда. Залишковий термін постійного припливу між середньоприпливною земною корою та нульовою системою квазігеоїда (1–4 cm на цій широті) враховується як окремий рядок у бюджеті невизначеності.</w:t>
+        <w:t>Показання гідрологічних постів перераховуються у нормальні висоти EVRF2019  за допомогою офіційної операції EPSG:9902 , вибірка яких здійснюється з виробничої сітки на кожній станції (перетворені щоденні значення 10,194 d); зміщення є просторово змінним, від 0.1715  до 0.2157 m, тому жодна єдина національна константа не є прийнятною. Висоти ICESat-2 ATL13 h редукуються за допомогою квазігеоїда EGG2015  після додавання поправки ATL03  для переходу від безприпливної до середньоприпливної системи, щоб висота земної кори у середньоприпливній системі не порівнювалася з нульовою системою квазігеоїда без явного виконання перерахунку. Висоти SWOT PIXC редукуються шляхом віднімання припливів твердої Землі, навантажувальних та полюсних припливів, які надаються у продукті, але не застосовуються (ніколи не віднімається поле геоїда), а потім за допомогою того самого квазігеоїда. Залишковий член постійного припливу між середньоприпливною земною корою та нульовою системою квазігеоїда (1–4 cm на цій широті) враховується як окремий рядок у бюджеті невизначеності.</w:t>
       </w:r>
     </w:p>
     <w:p>
@@ -591,7 +636,7 @@
         <w:pStyle w:val="Heading1"/>
       </w:pPr>
       <w:r>
-        <w:t>4.6 Bed reconstruction</w:t>
+        <w:t>4.6 Sentinel-2 water masks</w:t>
       </w:r>
     </w:p>
     <w:p>
@@ -600,7 +645,7 @@
         <w:jc w:val="both"/>
       </w:pPr>
       <w:r>
-        <w:t>Для водосховища дно інтерполюється виключно за даними промірів глибин (звичайний кригінг, зворотна відстань, лінійні та радіально-базисні інтерполятори) на канонічній сітці 250 m, закріпленій за спостережуваною береговою лінією 5  червня 2023 , та оцінюється за допомогою просторової блокової крос-валідації при 1 km, що відповідає медіанній відстані між промірами. Для зон нижче за течією такий самий дизайн повторюється з трьома варіантами: лише проміри глибин, проміри глибин із м'якими обмеженнями берегової лінії Sentinel-2  та проміри глибин із псевдоточками p18 , причому варіант обирається на основі оцінки лише за промірами глибин.</w:t>
+        <w:t>Маски води відповідають фіксованому правилу NDWI/MNDWI/класифікації сцени на сітці реєстру 20 m із застосуванням зміщення BOA; поріг покриття допускає дату для порівняння плану русла до/після прориву греблі лише тоді, коли спостерігається принаймні 80 % площі охоплення, і для обох періодів потрібно три такі дати перед формуванням будь-якої інференційної статистики. Контури берегової лінії на трьох рівнях до прориву греблі вилучаються за допомогою субпіксельного оцінювача «крокуючих квадратів», чия чисельна коректність була перевірена на аналітичному полі перед використанням.</w:t>
       </w:r>
     </w:p>
     <w:p>
@@ -608,85 +653,7 @@
         <w:pStyle w:val="Heading1"/>
       </w:pPr>
       <w:r>
-        <w:t>4.7 Sentinel-2 water masks and shoreline contours</w:t>
-      </w:r>
-    </w:p>
-    <w:p>
-      <w:pPr>
-        <w:spacing w:line="360" w:lineRule="auto"/>
-        <w:jc w:val="both"/>
-      </w:pPr>
-      <w:r>
-        <w:t>Маски води відповідають фіксованому правилу NDWI/MNDWI/класифікації сцени на сітці реєстру 20 m із застосуванням зміщення BOA; поріг покриття допускає дату для порівняння плану русла до/після прориву греблі лише тоді, коли спостерігається принаймні 80 % площі охоплення, і для обох періодів потрібно три такі дати перед формуванням будь-якої інференційної статистики. Контури берегової лінії на трьох рівнях до прориву греблі вилучаються за допомогою субпіксельного оцінювача «крокуючих квадратів», чия чисельна коректність була перевірена на аналітичному полі перед використанням.</w:t>
-      </w:r>
-    </w:p>
-    <w:p>
-      <w:pPr>
-        <w:pStyle w:val="Heading1"/>
-      </w:pPr>
-      <w:r>
-        <w:t>4.8 Statistical rules</w:t>
-      </w:r>
-    </w:p>
-    <w:p>
-      <w:pPr>
-        <w:spacing w:line="360" w:lineRule="auto"/>
-        <w:jc w:val="both"/>
-      </w:pPr>
-      <w:r>
-        <w:t xml:space="preserve">&gt; </w:t>
-      </w:r>
-      <w:r>
-        <w:rPr>
-          <w:b/>
-        </w:rPr>
-        <w:t>[PENDING OPEN92]</w:t>
-      </w:r>
-      <w:r>
-        <w:t xml:space="preserve"> translation rejected: locked tokens did not round-trip; English kept</w:t>
-      </w:r>
-    </w:p>
-    <w:p>
-      <w:pPr>
-        <w:spacing w:line="360" w:lineRule="auto"/>
-        <w:jc w:val="both"/>
-      </w:pPr>
-      <w:r>
-        <w:t>&gt; `section: paragraph 53` · `status: blocked`</w:t>
-      </w:r>
-    </w:p>
-    <w:p>
-      <w:pPr>
-        <w:spacing w:line="360" w:lineRule="auto"/>
-        <w:jc w:val="both"/>
-      </w:pPr>
-      <w:r>
-        <w:t>&gt; `blocks_submission: yes`</w:t>
-      </w:r>
-    </w:p>
-    <w:p>
-      <w:pPr>
-        <w:spacing w:line="360" w:lineRule="auto"/>
-        <w:jc w:val="both"/>
-      </w:pPr>
-      <w:r>
-        <w:t>Every statistic names its independent unit. Absence statements about the literature are made only for a screened sample with a stated denominator, and only after retrieval has been validated against hold-out controls.</w:t>
-      </w:r>
-    </w:p>
-    <w:p>
-      <w:pPr>
-        <w:pStyle w:val="Title"/>
-      </w:pPr>
-      <w:r>
-        <w:t>5. VALIDATION RESULTS</w:t>
-      </w:r>
-    </w:p>
-    <w:p>
-      <w:pPr>
-        <w:pStyle w:val="Heading1"/>
-      </w:pPr>
-      <w:r>
-        <w:t>5.1 The gauge network in one geodetic frame</w:t>
+        <w:t>4.7 Statistical rules</w:t>
       </w:r>
     </w:p>
     <w:p>
@@ -713,7 +680,7 @@
         <w:jc w:val="both"/>
       </w:pPr>
       <w:r>
-        <w:t>&gt; `section: paragraph 56` · `status: blocked`</w:t>
+        <w:t>&gt; `section: paragraph 52` · `status: blocked`</w:t>
       </w:r>
     </w:p>
     <w:p>
@@ -731,7 +698,32 @@
         <w:jc w:val="both"/>
       </w:pPr>
       <w:r>
-        <w:t>10,194 daily values transformed (grid sampler agrees with an independent implementation to 0.000 mm). 0.1715 to 0.2157 m (spread 44 mm; grid accuracy 0.068 m (EPSG registry)).</w:t>
+        <w:t>Every statistic names its independent unit. Absence statements about the literature are made only for a screened sample with a stated denominator, and only after retrieval has been validated against hold-out controls.</w:t>
+      </w:r>
+    </w:p>
+    <w:p>
+      <w:pPr>
+        <w:pStyle w:val="Title"/>
+      </w:pPr>
+      <w:r>
+        <w:t>5. THE FRAME: DOES THE HARMONISATION HOLD?</w:t>
+      </w:r>
+    </w:p>
+    <w:p>
+      <w:pPr>
+        <w:pStyle w:val="Heading1"/>
+      </w:pPr>
+      <w:r>
+        <w:t>5.1 The gauge network in one geodetic frame</w:t>
+      </w:r>
+    </w:p>
+    <w:p>
+      <w:pPr>
+        <w:spacing w:line="360" w:lineRule="auto"/>
+        <w:jc w:val="both"/>
+      </w:pPr>
+      <w:r>
+        <w:t>Усі сім записів гідрологічних постів перераховано в EVRF2019  за допомогою офіційної операції, застосованої до власних координат кожної станції, а не до національного середнього значення: щоденні значення 10,194 d трансформовані (сітковий семплер узгоджується з незалежною реалізацією до 0.000 m м). Зміщення не є постійним уздовж ділянки — від 0.1715  до 0.2157 m (розкид 44 m м; точність сітки 0.068 m (реєстр EPSG)) — саме тому єдине число було б помилковим для обох кінців басейну.</w:t>
       </w:r>
     </w:p>
     <w:p>
@@ -743,7 +735,7 @@
         <w:rPr>
           <w:b/>
         </w:rPr>
-        <w:t>Таблиця 2.  Вертикальний ланцюг: вихідна система координат кожного датчика, застосована корекція та залишкове значення відносно гідрологічних постів.</w:t>
+        <w:t>Таблиця 2.  Вертикальний ланцюг: кожен етап гармонізації та залишок, який він залишає.</w:t>
       </w:r>
     </w:p>
     <w:tbl>
@@ -754,75 +746,47 @@
         <w:tblLook w:firstColumn="1" w:firstRow="1" w:lastColumn="0" w:lastRow="0" w:noHBand="0" w:noVBand="1" w:val="04A0"/>
       </w:tblPr>
       <w:tblGrid>
-        <w:gridCol w:w="1728"/>
-        <w:gridCol w:w="1728"/>
-        <w:gridCol w:w="1728"/>
-        <w:gridCol w:w="1728"/>
-        <w:gridCol w:w="1728"/>
+        <w:gridCol w:w="2880"/>
+        <w:gridCol w:w="2880"/>
+        <w:gridCol w:w="2880"/>
       </w:tblGrid>
       <w:tr>
         <w:tc>
           <w:tcPr>
-            <w:tcW w:type="dxa" w:w="1728"/>
+            <w:tcW w:type="dxa" w:w="2880"/>
           </w:tcPr>
           <w:p>
             <w:r>
               <w:rPr>
                 <w:b/>
               </w:rPr>
-              <w:t>claim_id</w:t>
+              <w:t>Step</w:t>
             </w:r>
           </w:p>
         </w:tc>
         <w:tc>
           <w:tcPr>
-            <w:tcW w:type="dxa" w:w="1728"/>
+            <w:tcW w:type="dxa" w:w="2880"/>
           </w:tcPr>
           <w:p>
             <w:r>
               <w:rPr>
                 <w:b/>
               </w:rPr>
-              <w:t>claim_text</w:t>
+              <w:t>Result</w:t>
             </w:r>
           </w:p>
         </w:tc>
         <w:tc>
           <w:tcPr>
-            <w:tcW w:type="dxa" w:w="1728"/>
+            <w:tcW w:type="dxa" w:w="2880"/>
           </w:tcPr>
           <w:p>
             <w:r>
               <w:rPr>
                 <w:b/>
               </w:rPr>
-              <w:t>value_resolved</w:t>
-            </w:r>
-          </w:p>
-        </w:tc>
-        <w:tc>
-          <w:tcPr>
-            <w:tcW w:type="dxa" w:w="1728"/>
-          </w:tcPr>
-          <w:p>
-            <w:r>
-              <w:rPr>
-                <w:b/>
-              </w:rPr>
-              <w:t>n_resolved</w:t>
-            </w:r>
-          </w:p>
-        </w:tc>
-        <w:tc>
-          <w:tcPr>
-            <w:tcW w:type="dxa" w:w="1728"/>
-          </w:tcPr>
-          <w:p>
-            <w:r>
-              <w:rPr>
-                <w:b/>
-              </w:rPr>
-              <w:t>audit_status</w:t>
+              <w:t>n</w:t>
             </w:r>
           </w:p>
         </w:tc>
@@ -830,27 +794,17 @@
       <w:tr>
         <w:tc>
           <w:tcPr>
-            <w:tcW w:type="dxa" w:w="1728"/>
+            <w:tcW w:type="dxa" w:w="2880"/>
           </w:tcPr>
           <w:p>
             <w:r>
-              <w:t>V1.1</w:t>
+              <w:t>Gauge stages carried to EVRF2019 (EPSG:9902)</w:t>
             </w:r>
           </w:p>
         </w:tc>
         <w:tc>
           <w:tcPr>
-            <w:tcW w:type="dxa" w:w="1728"/>
-          </w:tcPr>
-          <w:p>
-            <w:r>
-              <w:t>All gauge stages are carried into one geodetic frame by the official operation EPSG:9902 (BS-77 normal height -&gt; EVRF2019 normal height), applied at each station's own coordinates.</w:t>
-            </w:r>
-          </w:p>
-        </w:tc>
-        <w:tc>
-          <w:tcPr>
-            <w:tcW w:type="dxa" w:w="1728"/>
+            <w:tcW w:type="dxa" w:w="2880"/>
           </w:tcPr>
           <w:p>
             <w:r>
@@ -860,7 +814,7 @@
         </w:tc>
         <w:tc>
           <w:tcPr>
-            <w:tcW w:type="dxa" w:w="1728"/>
+            <w:tcW w:type="dxa" w:w="2880"/>
           </w:tcPr>
           <w:p>
             <w:r>
@@ -868,41 +822,21 @@
             </w:r>
           </w:p>
         </w:tc>
-        <w:tc>
-          <w:tcPr>
-            <w:tcW w:type="dxa" w:w="1728"/>
-          </w:tcPr>
-          <w:p>
-            <w:r>
-              <w:t>SUPPORTED</w:t>
-            </w:r>
-          </w:p>
-        </w:tc>
       </w:tr>
       <w:tr>
         <w:tc>
           <w:tcPr>
-            <w:tcW w:type="dxa" w:w="1728"/>
+            <w:tcW w:type="dxa" w:w="2880"/>
           </w:tcPr>
           <w:p>
             <w:r>
-              <w:t>V1.2</w:t>
+              <w:t>Spatial variation of the BS-77 → EVRF2019 offset</w:t>
             </w:r>
           </w:p>
         </w:tc>
         <w:tc>
           <w:tcPr>
-            <w:tcW w:type="dxa" w:w="1728"/>
-          </w:tcPr>
-          <w:p>
-            <w:r>
-              <w:t>The BS-77 -&gt; EVRF2019 offset is spatially varying across the study reach, so a single national constant is not admissible.</w:t>
-            </w:r>
-          </w:p>
-        </w:tc>
-        <w:tc>
-          <w:tcPr>
-            <w:tcW w:type="dxa" w:w="1728"/>
+            <w:tcW w:type="dxa" w:w="2880"/>
           </w:tcPr>
           <w:p>
             <w:r>
@@ -912,7 +846,7 @@
         </w:tc>
         <w:tc>
           <w:tcPr>
-            <w:tcW w:type="dxa" w:w="1728"/>
+            <w:tcW w:type="dxa" w:w="2880"/>
           </w:tcPr>
           <w:p>
             <w:r>
@@ -920,41 +854,21 @@
             </w:r>
           </w:p>
         </w:tc>
-        <w:tc>
-          <w:tcPr>
-            <w:tcW w:type="dxa" w:w="1728"/>
-          </w:tcPr>
-          <w:p>
-            <w:r>
-              <w:t>SUPPORTED</w:t>
-            </w:r>
-          </w:p>
-        </w:tc>
       </w:tr>
       <w:tr>
         <w:tc>
           <w:tcPr>
-            <w:tcW w:type="dxa" w:w="1728"/>
+            <w:tcW w:type="dxa" w:w="2880"/>
           </w:tcPr>
           <w:p>
             <w:r>
-              <w:t>V2.1</w:t>
+              <w:t>SWOT PIXC correction chain against RiverSP</w:t>
             </w:r>
           </w:p>
         </w:tc>
         <w:tc>
           <w:tcPr>
-            <w:tcW w:type="dxa" w:w="1728"/>
-          </w:tcPr>
-          <w:p>
-            <w:r>
-              <w:t>The documented SWOT PIXC chain height-(solid_earth_tide+load_tide_fes+pole_tide) reproduces RiverSP node heights of the same cycle and pass; the three alternative branches do not.</w:t>
-            </w:r>
-          </w:p>
-        </w:tc>
-        <w:tc>
-          <w:tcPr>
-            <w:tcW w:type="dxa" w:w="1728"/>
+            <w:tcW w:type="dxa" w:w="2880"/>
           </w:tcPr>
           <w:p>
             <w:r>
@@ -964,7 +878,7 @@
         </w:tc>
         <w:tc>
           <w:tcPr>
-            <w:tcW w:type="dxa" w:w="1728"/>
+            <w:tcW w:type="dxa" w:w="2880"/>
           </w:tcPr>
           <w:p>
             <w:r>
@@ -972,41 +886,21 @@
             </w:r>
           </w:p>
         </w:tc>
-        <w:tc>
-          <w:tcPr>
-            <w:tcW w:type="dxa" w:w="1728"/>
-          </w:tcPr>
-          <w:p>
-            <w:r>
-              <w:t>SUPPORTED</w:t>
-            </w:r>
-          </w:p>
-        </w:tc>
       </w:tr>
       <w:tr>
         <w:tc>
           <w:tcPr>
-            <w:tcW w:type="dxa" w:w="1728"/>
+            <w:tcW w:type="dxa" w:w="2880"/>
           </w:tcPr>
           <w:p>
             <w:r>
-              <w:t>V3.1</w:t>
+              <w:t>SWOT against ICESat-2, best collocation</w:t>
             </w:r>
           </w:p>
         </w:tc>
         <w:tc>
           <w:tcPr>
-            <w:tcW w:type="dxa" w:w="1728"/>
-          </w:tcPr>
-          <w:p>
-            <w:r>
-              <w:t>Under good temporal collocation SWOT and ICESat-2 water-surface heights agree at the centimetre level in the common frame with no correction applied.</w:t>
-            </w:r>
-          </w:p>
-        </w:tc>
-        <w:tc>
-          <w:tcPr>
-            <w:tcW w:type="dxa" w:w="1728"/>
+            <w:tcW w:type="dxa" w:w="2880"/>
           </w:tcPr>
           <w:p>
             <w:r>
@@ -1016,7 +910,7 @@
         </w:tc>
         <w:tc>
           <w:tcPr>
-            <w:tcW w:type="dxa" w:w="1728"/>
+            <w:tcW w:type="dxa" w:w="2880"/>
           </w:tcPr>
           <w:p>
             <w:r>
@@ -1024,41 +918,21 @@
             </w:r>
           </w:p>
         </w:tc>
-        <w:tc>
-          <w:tcPr>
-            <w:tcW w:type="dxa" w:w="1728"/>
-          </w:tcPr>
-          <w:p>
-            <w:r>
-              <w:t>SUPPORTED</w:t>
-            </w:r>
-          </w:p>
-        </w:tc>
       </w:tr>
       <w:tr>
         <w:tc>
           <w:tcPr>
-            <w:tcW w:type="dxa" w:w="1728"/>
+            <w:tcW w:type="dxa" w:w="2880"/>
           </w:tcPr>
           <w:p>
             <w:r>
-              <w:t>V4.1</w:t>
+              <w:t>SWOT against the Kherson gauge</w:t>
             </w:r>
           </w:p>
         </w:tc>
         <w:tc>
           <w:tcPr>
-            <w:tcW w:type="dxa" w:w="1728"/>
-          </w:tcPr>
-          <w:p>
-            <w:r>
-              <w:t>The SWOT branch is locally consistent with the independent Kherson in-situ record.</w:t>
-            </w:r>
-          </w:p>
-        </w:tc>
-        <w:tc>
-          <w:tcPr>
-            <w:tcW w:type="dxa" w:w="1728"/>
+            <w:tcW w:type="dxa" w:w="2880"/>
           </w:tcPr>
           <w:p>
             <w:r>
@@ -1068,7 +942,7 @@
         </w:tc>
         <w:tc>
           <w:tcPr>
-            <w:tcW w:type="dxa" w:w="1728"/>
+            <w:tcW w:type="dxa" w:w="2880"/>
           </w:tcPr>
           <w:p>
             <w:r>
@@ -1076,93 +950,21 @@
             </w:r>
           </w:p>
         </w:tc>
-        <w:tc>
-          <w:tcPr>
-            <w:tcW w:type="dxa" w:w="1728"/>
-          </w:tcPr>
-          <w:p>
-            <w:r>
-              <w:t>SUPPORTED</w:t>
-            </w:r>
-          </w:p>
-        </w:tc>
       </w:tr>
       <w:tr>
         <w:tc>
           <w:tcPr>
-            <w:tcW w:type="dxa" w:w="1728"/>
+            <w:tcW w:type="dxa" w:w="2880"/>
           </w:tcPr>
           <w:p>
             <w:r>
-              <w:t>V4.2</w:t>
+              <w:t>Transfer of the reservoir alignment constant to Kherson</w:t>
             </w:r>
           </w:p>
         </w:tc>
         <w:tc>
           <w:tcPr>
-            <w:tcW w:type="dxa" w:w="1728"/>
-          </w:tcPr>
-          <w:p>
-            <w:r>
-              <w:t>The 2023-04-05 SWOT-ICESat-2 discrepancy is NOT explained by the Kherson hydrograph: the gauge was rising, so hydrology predicts the opposite sign and enlarges the residual.</w:t>
-            </w:r>
-          </w:p>
-        </w:tc>
-        <w:tc>
-          <w:tcPr>
-            <w:tcW w:type="dxa" w:w="1728"/>
-          </w:tcPr>
-          <w:p>
-            <w:r>
-              <w:t>observed -18.1 cm; expected +5.9 cm from gauge +10.0 cm/day over dt 14.2 h</w:t>
-            </w:r>
-          </w:p>
-        </w:tc>
-        <w:tc>
-          <w:tcPr>
-            <w:tcW w:type="dxa" w:w="1728"/>
-          </w:tcPr>
-          <w:p>
-            <w:r>
-              <w:t>1</w:t>
-            </w:r>
-          </w:p>
-        </w:tc>
-        <w:tc>
-          <w:tcPr>
-            <w:tcW w:type="dxa" w:w="1728"/>
-          </w:tcPr>
-          <w:p>
-            <w:r>
-              <w:t>NOT_TESTABLE</w:t>
-            </w:r>
-          </w:p>
-        </w:tc>
-      </w:tr>
-      <w:tr>
-        <w:tc>
-          <w:tcPr>
-            <w:tcW w:type="dxa" w:w="1728"/>
-          </w:tcPr>
-          <w:p>
-            <w:r>
-              <w:t>V5.1</w:t>
-            </w:r>
-          </w:p>
-        </w:tc>
-        <w:tc>
-          <w:tcPr>
-            <w:tcW w:type="dxa" w:w="1728"/>
-          </w:tcPr>
-          <w:p>
-            <w:r>
-              <w:t>The reservoir-derived empirical alignment constant does not transfer to the Kherson reach: the two independent estimates have disjoint confidence intervals, and zero lies inside Kherson's.</w:t>
-            </w:r>
-          </w:p>
-        </w:tc>
-        <w:tc>
-          <w:tcPr>
-            <w:tcW w:type="dxa" w:w="1728"/>
+            <w:tcW w:type="dxa" w:w="2880"/>
           </w:tcPr>
           <w:p>
             <w:r>
@@ -1172,7 +974,7 @@
         </w:tc>
         <w:tc>
           <w:tcPr>
-            <w:tcW w:type="dxa" w:w="1728"/>
+            <w:tcW w:type="dxa" w:w="2880"/>
           </w:tcPr>
           <w:p>
             <w:r>
@@ -1180,41 +982,21 @@
             </w:r>
           </w:p>
         </w:tc>
-        <w:tc>
-          <w:tcPr>
-            <w:tcW w:type="dxa" w:w="1728"/>
-          </w:tcPr>
-          <w:p>
-            <w:r>
-              <w:t>SUPPORTED</w:t>
-            </w:r>
-          </w:p>
-        </w:tc>
       </w:tr>
       <w:tr>
         <w:tc>
           <w:tcPr>
-            <w:tcW w:type="dxa" w:w="1728"/>
+            <w:tcW w:type="dxa" w:w="2880"/>
           </w:tcPr>
           <w:p>
             <w:r>
-              <w:t>V6.1</w:t>
+              <w:t>Reduction level of the legacy soundings</w:t>
             </w:r>
           </w:p>
         </w:tc>
         <w:tc>
           <w:tcPr>
-            <w:tcW w:type="dxa" w:w="1728"/>
-          </w:tcPr>
-          <w:p>
-            <w:r>
-              <w:t>The S-57 sounding depths are reduced to the published navigation drawdown level UNS 14.00 m, not to the normal impoundment level 16.00 m. On 14.00 m the survey and ICESat-2 exposed bed agree within uncertainty; on 16.00</w:t>
-            </w:r>
-          </w:p>
-        </w:tc>
-        <w:tc>
-          <w:tcPr>
-            <w:tcW w:type="dxa" w:w="1728"/>
+            <w:tcW w:type="dxa" w:w="2880"/>
           </w:tcPr>
           <w:p>
             <w:r>
@@ -1224,7 +1006,7 @@
         </w:tc>
         <w:tc>
           <w:tcPr>
-            <w:tcW w:type="dxa" w:w="1728"/>
+            <w:tcW w:type="dxa" w:w="2880"/>
           </w:tcPr>
           <w:p>
             <w:r>
@@ -1232,41 +1014,21 @@
             </w:r>
           </w:p>
         </w:tc>
-        <w:tc>
-          <w:tcPr>
-            <w:tcW w:type="dxa" w:w="1728"/>
-          </w:tcPr>
-          <w:p>
-            <w:r>
-              <w:t>SUPPORTED</w:t>
-            </w:r>
-          </w:p>
-        </w:tc>
       </w:tr>
       <w:tr>
         <w:tc>
           <w:tcPr>
-            <w:tcW w:type="dxa" w:w="1728"/>
+            <w:tcW w:type="dxa" w:w="2880"/>
           </w:tcPr>
           <w:p>
             <w:r>
-              <w:t>V6.2</w:t>
+              <w:t>Historical reference level in EVRF2019</w:t>
             </w:r>
           </w:p>
         </w:tc>
         <w:tc>
           <w:tcPr>
-            <w:tcW w:type="dxa" w:w="1728"/>
-          </w:tcPr>
-          <w:p>
-            <w:r>
-              <w:t>The historical reference level carried into EVRF2019 is spatially varying, not a constant.</w:t>
-            </w:r>
-          </w:p>
-        </w:tc>
-        <w:tc>
-          <w:tcPr>
-            <w:tcW w:type="dxa" w:w="1728"/>
+            <w:tcW w:type="dxa" w:w="2880"/>
           </w:tcPr>
           <w:p>
             <w:r>
@@ -1276,7 +1038,7 @@
         </w:tc>
         <w:tc>
           <w:tcPr>
-            <w:tcW w:type="dxa" w:w="1728"/>
+            <w:tcW w:type="dxa" w:w="2880"/>
           </w:tcPr>
           <w:p>
             <w:r>
@@ -1284,41 +1046,21 @@
             </w:r>
           </w:p>
         </w:tc>
-        <w:tc>
-          <w:tcPr>
-            <w:tcW w:type="dxa" w:w="1728"/>
-          </w:tcPr>
-          <w:p>
-            <w:r>
-              <w:t>SUPPORTED</w:t>
-            </w:r>
-          </w:p>
-        </w:tc>
       </w:tr>
       <w:tr>
         <w:tc>
           <w:tcPr>
-            <w:tcW w:type="dxa" w:w="1728"/>
+            <w:tcW w:type="dxa" w:w="2880"/>
           </w:tcPr>
           <w:p>
             <w:r>
-              <w:t>V7.1</w:t>
+              <w:t>Digitised 1970 free-surface curve against Table 20</w:t>
             </w:r>
           </w:p>
         </w:tc>
         <w:tc>
           <w:tcPr>
-            <w:tcW w:type="dxa" w:w="1728"/>
-          </w:tcPr>
-          <w:p>
-            <w:r>
-              <w:t>The digitised field-measured historical longitudinal free-surface curve (Fig. 16 curve 2, 22-25 April 1970) reproduces the independently tabulated profile of Table 20 to a few centimetres over the pool.</w:t>
-            </w:r>
-          </w:p>
-        </w:tc>
-        <w:tc>
-          <w:tcPr>
-            <w:tcW w:type="dxa" w:w="1728"/>
+            <w:tcW w:type="dxa" w:w="2880"/>
           </w:tcPr>
           <w:p>
             <w:r>
@@ -1328,7 +1070,7 @@
         </w:tc>
         <w:tc>
           <w:tcPr>
-            <w:tcW w:type="dxa" w:w="1728"/>
+            <w:tcW w:type="dxa" w:w="2880"/>
           </w:tcPr>
           <w:p>
             <w:r>
@@ -1336,41 +1078,21 @@
             </w:r>
           </w:p>
         </w:tc>
-        <w:tc>
-          <w:tcPr>
-            <w:tcW w:type="dxa" w:w="1728"/>
-          </w:tcPr>
-          <w:p>
-            <w:r>
-              <w:t>SUPPORTED</w:t>
-            </w:r>
-          </w:p>
-        </w:tc>
       </w:tr>
       <w:tr>
         <w:tc>
           <w:tcPr>
-            <w:tcW w:type="dxa" w:w="1728"/>
+            <w:tcW w:type="dxa" w:w="2880"/>
           </w:tcPr>
           <w:p>
             <w:r>
-              <w:t>V7.2</w:t>
+              <w:t>Pre-breach ICESat-2 slopes in the impounded reach</w:t>
             </w:r>
           </w:p>
         </w:tc>
         <w:tc>
           <w:tcPr>
-            <w:tcW w:type="dxa" w:w="1728"/>
-          </w:tcPr>
-          <w:p>
-            <w:r>
-              <w:t>Pre-breach ICESat-2 water-surface slopes are statistically indistinguishable from zero throughout the impounded reach and steepen in the uppermost reach, reproducing the documented free-surface geometry (near-level main</w:t>
-            </w:r>
-          </w:p>
-        </w:tc>
-        <w:tc>
-          <w:tcPr>
-            <w:tcW w:type="dxa" w:w="1728"/>
+            <w:tcW w:type="dxa" w:w="2880"/>
           </w:tcPr>
           <w:p>
             <w:r>
@@ -1380,7 +1102,7 @@
         </w:tc>
         <w:tc>
           <w:tcPr>
-            <w:tcW w:type="dxa" w:w="1728"/>
+            <w:tcW w:type="dxa" w:w="2880"/>
           </w:tcPr>
           <w:p>
             <w:r>
@@ -1388,93 +1110,21 @@
             </w:r>
           </w:p>
         </w:tc>
-        <w:tc>
-          <w:tcPr>
-            <w:tcW w:type="dxa" w:w="1728"/>
-          </w:tcPr>
-          <w:p>
-            <w:r>
-              <w:t>SUPPORTED_WITH_LIMITATION</w:t>
-            </w:r>
-          </w:p>
-        </w:tc>
       </w:tr>
       <w:tr>
         <w:tc>
           <w:tcPr>
-            <w:tcW w:type="dxa" w:w="1728"/>
+            <w:tcW w:type="dxa" w:w="2880"/>
           </w:tcPr>
           <w:p>
             <w:r>
-              <w:t>V8.1</w:t>
+              <w:t>Production BS-77 → EVRF2019 grid</w:t>
             </w:r>
           </w:p>
         </w:tc>
         <w:tc>
           <w:tcPr>
-            <w:tcW w:type="dxa" w:w="1728"/>
-          </w:tcPr>
-          <w:p>
-            <w:r>
-              <w:t>Instantaneous water-level disturbances documented for this reservoir (seiches, wind setup) are far larger than the mean longitudinal hydraulic gradient, which explains why individual pre-breach overpasses can show small</w:t>
-            </w:r>
-          </w:p>
-        </w:tc>
-        <w:tc>
-          <w:tcPr>
-            <w:tcW w:type="dxa" w:w="1728"/>
-          </w:tcPr>
-          <w:p>
-            <w:r>
-              <w:t>mean hydraulic rise over 183 km: 0 cm (Qmin), 6 cm (Q20%), 42 cm (Q1%) / seiche half-range at an antinode 17.5 cm / wind setup at an end 35 cm (15 m/s) to 148 cm (25 m/s)</w:t>
-            </w:r>
-          </w:p>
-        </w:tc>
-        <w:tc>
-          <w:tcPr>
-            <w:tcW w:type="dxa" w:w="1728"/>
-          </w:tcPr>
-          <w:p>
-            <w:r>
-              <w:t>6</w:t>
-            </w:r>
-          </w:p>
-        </w:tc>
-        <w:tc>
-          <w:tcPr>
-            <w:tcW w:type="dxa" w:w="1728"/>
-          </w:tcPr>
-          <w:p>
-            <w:r>
-              <w:t>SUPPORTED_WITH_LIMITATION</w:t>
-            </w:r>
-          </w:p>
-        </w:tc>
-      </w:tr>
-      <w:tr>
-        <w:tc>
-          <w:tcPr>
-            <w:tcW w:type="dxa" w:w="1728"/>
-          </w:tcPr>
-          <w:p>
-            <w:r>
-              <w:t>G1</w:t>
-            </w:r>
-          </w:p>
-        </w:tc>
-        <w:tc>
-          <w:tcPr>
-            <w:tcW w:type="dxa" w:w="1728"/>
-          </w:tcPr>
-          <w:p>
-            <w:r>
-              <w:t>One production BS-77 → EVRF2019 grid is used everywhere: ua_2019z.asc (ESRI ASCII, 167×99 at 0.15°, 3776 valid nodes, ETRS89/GRS80), which is the CRS-EU distribution «UA_KRON/NH to EVRF2019zero» of the EPSG:9902 operatio</w:t>
-            </w:r>
-          </w:p>
-        </w:tc>
-        <w:tc>
-          <w:tcPr>
-            <w:tcW w:type="dxa" w:w="1728"/>
+            <w:tcW w:type="dxa" w:w="2880"/>
           </w:tcPr>
           <w:p>
             <w:r>
@@ -1484,61 +1134,11 @@
         </w:tc>
         <w:tc>
           <w:tcPr>
-            <w:tcW w:type="dxa" w:w="1728"/>
-          </w:tcPr>
-          <w:p/>
-        </w:tc>
-        <w:tc>
-          <w:tcPr>
-            <w:tcW w:type="dxa" w:w="1728"/>
+            <w:tcW w:type="dxa" w:w="2880"/>
           </w:tcPr>
           <w:p>
             <w:r>
-              <w:t>SUPPORTED</w:t>
-            </w:r>
-          </w:p>
-        </w:tc>
-      </w:tr>
-      <w:tr>
-        <w:tc>
-          <w:tcPr>
-            <w:tcW w:type="dxa" w:w="1728"/>
-          </w:tcPr>
-          <w:p>
-            <w:r>
-              <w:t>G2</w:t>
-            </w:r>
-          </w:p>
-        </w:tc>
-        <w:tc>
-          <w:tcPr>
-            <w:tcW w:type="dxa" w:w="1728"/>
-          </w:tcPr>
-          <w:p>
-            <w:r>
-              <w:t>The EGG2015 quasigeoid raster in production (egg_2015.tif, 1′×1′) has no citable upstream source: the public ISG release is 10′×15′.</w:t>
-            </w:r>
-          </w:p>
-        </w:tc>
-        <w:tc>
-          <w:tcPr>
-            <w:tcW w:type="dxa" w:w="1728"/>
-          </w:tcPr>
-          <w:p/>
-        </w:tc>
-        <w:tc>
-          <w:tcPr>
-            <w:tcW w:type="dxa" w:w="1728"/>
-          </w:tcPr>
-          <w:p/>
-        </w:tc>
-        <w:tc>
-          <w:tcPr>
-            <w:tcW w:type="dxa" w:w="1728"/>
-          </w:tcPr>
-          <w:p>
-            <w:r>
-              <w:t>UNKNOWN</w:t>
+              <w:t>—</w:t>
             </w:r>
           </w:p>
         </w:tc>
@@ -1547,14 +1147,26 @@
     <w:p/>
     <w:p>
       <w:pPr>
-        <w:pStyle w:val="Heading1"/>
-      </w:pPr>
-      <w:r>
-        <w:t>5.2 The SWOT PIXC vertical chain</w:t>
+        <w:spacing w:line="360" w:lineRule="auto"/>
+        <w:jc w:val="both"/>
+      </w:pPr>
+      <w:r>
+        <w:rPr>
+          <w:i/>
+        </w:rPr>
+        <w:t>Залишки є медіанами, якщо не вказано довірчий інтервал. Растр квазігеоїда у виробництві (G2) не має джерела, на яке можна послатися; див. розділ 7.9.</w:t>
       </w:r>
     </w:p>
     <w:p>
       <w:pPr>
+        <w:pStyle w:val="Heading1"/>
+      </w:pPr>
+      <w:r>
+        <w:t>5.2 The SWOT PIXC vertical chain</w:t>
+      </w:r>
+    </w:p>
+    <w:p>
+      <w:pPr>
         <w:spacing w:line="360" w:lineRule="auto"/>
         <w:jc w:val="both"/>
       </w:pPr>
@@ -1576,7 +1188,7 @@
         <w:jc w:val="both"/>
       </w:pPr>
       <w:r>
-        <w:t>найкраща пара 2023-05-14: +0.0036 m (dt -2.28 h, 3417 сегментів) (повний набір: 2023-04-05 dt +14.2 h -&gt; -0.1810 m; 2023-05-04 dt +11.1 h -&gt; +0.0597 m; 2023-05-14 dt -2.3 h -&gt; +0.0036 m). Оскільки є три суміщені прольоти, регресія не підбирається і про універсальну сантиметрову узгодженість не йдеться.</w:t>
+        <w:t>Там, де два сенсори проходять з інтервалом у кілька годин, вони узгоджуються на сантиметровому рівні без застосування будь-яких коригувань між ними: найкраща пара 2023-05-14: +0.0036 m (dt -2.28 h, 3417 сегментів) (повний набір: 2023-04-05 dt +14.2 h -&gt; -0.1810 m; 2023-05-04 dt +11.1 h -&gt; +0.0597 m; 2023-05-14 dt -2.3 h -&gt; +0.0036 m). За наявності трьох суміщених прольотів регресія не підбирається і не стверджується про універсальну сантиметрову узгодженість.</w:t>
       </w:r>
     </w:p>
     <w:p>
@@ -1593,7 +1205,7 @@
         <w:jc w:val="both"/>
       </w:pPr>
       <w:r>
-        <w:t>+0.0264 m (супутник – гідрологічний пост) (NMAD 0.0413 m; 95% CI [-0.0420, +0.0394]; медіанні зміщення 8.4 cm для різних радіусів агрегації 0.5-5 km; n = 9).</w:t>
+        <w:t>На противагу єдиному безперервному ряду натурних спостережень у нижній течії, супутникова гілка розташовується в межах кількох сантиметрів від даних гідрологічного поста: +0.0264 m (супутник – пост) (NMAD 0.0413 m; 95% CI [-0.0420, +0.0394]; медіана зміщується на 8.4 cm залежно від радіусів агрегації 0.5-5 km; n = 9). Ця відповідність є локальною для Херсона і не є доказом для всього басейну.</w:t>
       </w:r>
     </w:p>
     <w:p>
@@ -1627,7 +1239,7 @@
         <w:jc w:val="both"/>
       </w:pPr>
       <w:r>
-        <w:t>водосховище -0.130 m [-0.184, -0.081] (n=5 станцій) проти Херсона +0.0051 m [-0.0515, +0.0608] (NMAD між станціями 0.033 m; радіус коливання 1.8 cm (Розумівка) та 5.0 cm (Херсон) протягом 1-10 km).</w:t>
+        <w:t>Константа вирівнювання, оцінена у водосховищі, не зберігається під час переміщення вниз за течією: Каховське водосховище -0.130 m [-0.184, -0.081] (n=5  станцій) проти Херсона +0.0051 m [-0.0515, +0.0608] (NMAD між станціями 0.033 m; радіус коливання 1.8 cm (Розумівка) та 5.0 cm (Херсон) понад 1-10 km). Ці дві оцінки мають неперетинні інтервали, тому корекція розглядається як локальна, а не як властивість датчика.</w:t>
       </w:r>
     </w:p>
     <w:p>
@@ -1669,7 +1281,7 @@
         <w:pStyle w:val="Heading1"/>
       </w:pPr>
       <w:r>
-        <w:t>5.9 Bed-surface reconstruction and cross-validation</w:t>
+        <w:t>5.9 What the frame is worth</w:t>
       </w:r>
     </w:p>
     <w:p>
@@ -1678,24 +1290,66 @@
         <w:jc w:val="both"/>
       </w:pPr>
       <w:r>
-        <w:t>preferred OK: RMSE 2.76 m, NMAD 1.32 m, bias -0.03 m, median |e| 0.89 m (ranking OK 2.76, IDW 2.78, LINEAR 2.82, RBF 3.23; the worst 5% of observations account for 51% of the squared prediction error; n = 7509). The boundary condition is the single most consequential choice: unconstrained 6.7% vs constrained at the observed 2023-06-05 waterline 12.3% (whole reservoir, OK surface). The error is one of local bed morphology, not of the vertical frame: random hold-out already gives 2.648 m; 1 km blocking adds only 1.04x (2.761 m) and 5 km blocking 1.20x.</w:t>
+        <w:t>Перед інтерпретацією будь-яких гідравлічних результатів було проведено шість перевірок на валідацію та узгодженість, одна з яких — аномалія 5  квітня 2023  — не пройшла перевірку, про що повідомляється як про негативний результат. Не всі шість перевірок є незалежними одна від одної: RiverSP та PIXC походять з одного й того самого спостереження SWOT, тому їхня відповідність підтверджує ланцюжок корекції, а не точність. Дійсно незалежними обмеженнями є записи гідрологічних постів та 1970  польове обстеження.</w:t>
       </w:r>
     </w:p>
     <w:p>
       <w:pPr>
-        <w:pStyle w:val="Heading1"/>
-      </w:pPr>
-      <w:r>
-        <w:t>5.9.1 An independent test of the reconstructed bed</w:t>
+        <w:pStyle w:val="Title"/>
+      </w:pPr>
+      <w:r>
+        <w:t>6. THE MEASUREMENT</w:t>
       </w:r>
     </w:p>
     <w:p>
       <w:pPr>
+        <w:pStyle w:val="Heading1"/>
+      </w:pPr>
+      <w:r>
+        <w:t>6.1 Pre-breach water-surface geometry</w:t>
+      </w:r>
+    </w:p>
+    <w:p>
+      <w:pPr>
         <w:spacing w:line="360" w:lineRule="auto"/>
         <w:jc w:val="both"/>
       </w:pPr>
       <w:r>
-        <w:t>Крос-валідація розділу 5.9  виключає проміри глибин із поверхні, побудованої на основі цих самих промірів, тому вона вимірює лише помилку інтерполяції. Наземні відбиття ICESat-2 , отримані над дном після його висихання, є незалежними від усіх вхідних даних для реконструкції, і відносно них поверхня демонструє СКП (RMSE) 1.448 m, зміщення +0.204 m, NMAD 0.882 m (P05 -2.04 m, P95 2.45 m; n = 16164  точок на 15  референсних наземних треках). Залишковий показник не є рівномірним, але він також не зростає плавно з відстанню: він по суті є сталим у межах одного кілометра від проміру (СКП (RMSE) 1.535 m, зміщення +0.291 m у найближчій смузі, і дещо кращі показники між 250  та 500 m, де дно менш круте, ніж у прибережній зоні, що охоплює більшу частину зйомки) і погіршується лише тоді, коли інтерполяція переходить в екстраполяцію — СКП (RMSE) 2.48 m за межами 2 km від проміру, на невеликій кількості точок. Стратифікація демонструє поріг підтримки, а не її градієнт. Частина того, що залишається, є реальною — проміри глибин передують прориву греблі, а фотони отримані після нього, тому зміни дна містяться в залишковому показнику і не можуть бути відокремлені від помилки реконструкції (наземні відбиття ICESat-2  над рідко вкритою рослинністю осадовою породою мають власне зміщення; порівняння проводиться між поверхнею за промірами 2019-22  та поверхнею 2023-24 , тому реальні зміни дна містяться в залишковому показнику).</w:t>
+        <w:t>До прориву греблі водойма перебувала майже на горизонтальному рівні. Ухили водної поверхні за окремими ділянками згідно з ICESat-2  (0-180 km: +0.00, -0.06, +0.06 cm/km; 210-240 km: +0.13 cm/km) лежать у межах історичного діапазону витрат води, наведеного в проектних таблицях, а крива вільної поверхні, виміряна в польових умовах 22–25  квітня 1970  року, оцифрована та перевірена за Таблицею 20  (медіанне відхилення +0.022 m; NMAD 0.045 m), обмежує їх зверху. Видимий ухил у смузі 180–210 km є артефактом геометрії пікетажу, а не гідравлічним сигналом (усі апроксимації в межах смуги отримані за допомогою одного прольоту; медіана відношення довжини пікетажу до довжини на місцевості становить 1.34  (p90 1.94, max 2.65)).</w:t>
+      </w:r>
+    </w:p>
+    <w:p>
+      <w:pPr>
+        <w:pStyle w:val="Heading1"/>
+      </w:pPr>
+      <w:r>
+        <w:t>6.2 Early establishment of the post-breach gradient</w:t>
+      </w:r>
+    </w:p>
+    <w:p>
+      <w:pPr>
+        <w:spacing w:line="360" w:lineRule="auto"/>
+        <w:jc w:val="both"/>
+      </w:pPr>
+      <w:r>
+        <w:t>Водойма спорожніла до кінця червня 2023, , тому перші доступні прольоти ICESat-2  над залишками системи — п'ять у період між 7  липня та 7  вересня — фіксують уже спорожнілу ділянку, а не перехідний процес дренажу. Вони від самого початку відображають градієнт після прориву греблі: медіана за оцінювачем Тейла–Сена +3.245 cm/km (2023-07-07..2023-09-07) (n = 5). Таким чином, нова геометрія сформувалася протягом кількох тижнів після виснаження і не є особливістю лише стабілізованої вибірки 2024–25 . Ці прольоти не використовуються для реконструкції самого дренажу; це є предметом наступного розділу.</w:t>
+      </w:r>
+    </w:p>
+    <w:p>
+      <w:pPr>
+        <w:pStyle w:val="Heading1"/>
+      </w:pPr>
+      <w:r>
+        <w:t>6.2.1 The drawdown and the flood wave from orbit</w:t>
+      </w:r>
+    </w:p>
+    <w:p>
+      <w:pPr>
+        <w:spacing w:line="360" w:lineRule="auto"/>
+        <w:jc w:val="both"/>
+      </w:pPr>
+      <w:r>
+        <w:t>Те, що місія SWOT зафіксувала цю подію, не є новим спостереженням: повінь нижче греблі вже була описана за даними тієї ж місії та використана для тестування моделей паводків від прориву греблі ((Lehnigk et al., 2026)). Новизна цього дослідження полягає у самому витоку, представленому в тій же вертикальній системі відліку, що й гідрологічні пости та дно. Оскільки калібрувальна орбіта проходила над витоком щодня, спорожнення водойми було зафіксовано безпосередньо, а не виведено шляхом розрахунків: витік 5.63 m EVRF2019  станом на 13  червня, порівняно з 17.53 m станом на 31  травня (n = 3  вузлів SWOT на дату). Нижче греблі ті самі проходи описують хвилю, що переносила цю воду, з підйомом 9.10 m о 15 km (пік 10.24 m о 2023-06-07) та спадом вниз за течією приблизно до двох метрів до 80 km. Обидва ряди є знімками з кількох вузлів на дату (кількість вузлів на дату невелика (1-3), а деякі дати базуються на одному вузлі; ряд є послідовністю знімків, а не виміряним гідрографом), тому їх слід розглядати як послідовність спостережуваних висот водної поверхні, а не як гідрограф.</w:t>
       </w:r>
     </w:p>
     <w:p>
@@ -1707,7 +1361,7 @@
         <w:rPr>
           <w:b/>
         </w:rPr>
-        <w:t>Таблиця 8.  Незалежна валідація реконструйованого дна та наданого рельєфу відносно ICESat-2,  за типом опори та за продуктом.</w:t>
+        <w:t>Table 4. Спрацювання та паводкова хвиля, зафіксовані SWOT.</w:t>
       </w:r>
     </w:p>
     <w:tbl>
@@ -1718,89 +1372,47 @@
         <w:tblLook w:firstColumn="1" w:firstRow="1" w:lastColumn="0" w:lastRow="0" w:noHBand="0" w:noVBand="1" w:val="04A0"/>
       </w:tblPr>
       <w:tblGrid>
-        <w:gridCol w:w="1440"/>
-        <w:gridCol w:w="1440"/>
-        <w:gridCol w:w="1440"/>
-        <w:gridCol w:w="1440"/>
-        <w:gridCol w:w="1440"/>
-        <w:gridCol w:w="1440"/>
+        <w:gridCol w:w="2880"/>
+        <w:gridCol w:w="2880"/>
+        <w:gridCol w:w="2880"/>
       </w:tblGrid>
       <w:tr>
         <w:tc>
           <w:tcPr>
-            <w:tcW w:type="dxa" w:w="1440"/>
+            <w:tcW w:type="dxa" w:w="2880"/>
           </w:tcPr>
           <w:p>
             <w:r>
               <w:rPr>
                 <w:b/>
               </w:rPr>
-              <w:t>claim_id</w:t>
+              <w:t>Quantity</w:t>
             </w:r>
           </w:p>
         </w:tc>
         <w:tc>
           <w:tcPr>
-            <w:tcW w:type="dxa" w:w="1440"/>
+            <w:tcW w:type="dxa" w:w="2880"/>
           </w:tcPr>
           <w:p>
             <w:r>
               <w:rPr>
                 <w:b/>
               </w:rPr>
-              <w:t>claim_text</w:t>
+              <w:t>Value</w:t>
             </w:r>
           </w:p>
         </w:tc>
         <w:tc>
           <w:tcPr>
-            <w:tcW w:type="dxa" w:w="1440"/>
+            <w:tcW w:type="dxa" w:w="2880"/>
           </w:tcPr>
           <w:p>
             <w:r>
               <w:rPr>
                 <w:b/>
               </w:rPr>
-              <w:t>value_resolved</w:t>
-            </w:r>
-          </w:p>
-        </w:tc>
-        <w:tc>
-          <w:tcPr>
-            <w:tcW w:type="dxa" w:w="1440"/>
-          </w:tcPr>
-          <w:p>
-            <w:r>
-              <w:rPr>
-                <w:b/>
-              </w:rPr>
-              <w:t>uncertainty_resolved</w:t>
-            </w:r>
-          </w:p>
-        </w:tc>
-        <w:tc>
-          <w:tcPr>
-            <w:tcW w:type="dxa" w:w="1440"/>
-          </w:tcPr>
-          <w:p>
-            <w:r>
-              <w:rPr>
-                <w:b/>
-              </w:rPr>
-              <w:t>n_resolved</w:t>
-            </w:r>
-          </w:p>
-        </w:tc>
-        <w:tc>
-          <w:tcPr>
-            <w:tcW w:type="dxa" w:w="1440"/>
-          </w:tcPr>
-          <w:p>
-            <w:r>
-              <w:rPr>
-                <w:b/>
-              </w:rPr>
-              <w:t>audit_status</w:t>
+              <w:t>n</w:t>
             </w:r>
           </w:p>
         </w:tc>
@@ -1808,61 +1420,31 @@
       <w:tr>
         <w:tc>
           <w:tcPr>
-            <w:tcW w:type="dxa" w:w="1440"/>
+            <w:tcW w:type="dxa" w:w="2880"/>
           </w:tcPr>
           <w:p>
             <w:r>
-              <w:t>B4.1</w:t>
+              <w:t>Outlet water surface, 31 May → 13 June 2023</w:t>
             </w:r>
           </w:p>
         </w:tc>
         <w:tc>
           <w:tcPr>
-            <w:tcW w:type="dxa" w:w="1440"/>
+            <w:tcW w:type="dxa" w:w="2880"/>
           </w:tcPr>
           <w:p>
             <w:r>
-              <w:t>The reconstructed reservoir bed, built from legacy soundings alone, is tested against ICESat-2 ground returns acquired over the dry exposed bed after the breach — an observation independent of every input to the reconstr</w:t>
+              <w:t>outlet 5.63 m EVRF2019 on 13 June, from 17.53 m on 31 May</w:t>
             </w:r>
           </w:p>
         </w:tc>
         <w:tc>
           <w:tcPr>
-            <w:tcW w:type="dxa" w:w="1440"/>
+            <w:tcW w:type="dxa" w:w="2880"/>
           </w:tcPr>
           <w:p>
             <w:r>
-              <w:t>RMSE 1.448 m, bias +0.204 m, NMAD 0.882 m</w:t>
-            </w:r>
-          </w:p>
-        </w:tc>
-        <w:tc>
-          <w:tcPr>
-            <w:tcW w:type="dxa" w:w="1440"/>
-          </w:tcPr>
-          <w:p>
-            <w:r>
-              <w:t>P05 -2.04 m, P95 2.45 m</w:t>
-            </w:r>
-          </w:p>
-        </w:tc>
-        <w:tc>
-          <w:tcPr>
-            <w:tcW w:type="dxa" w:w="1440"/>
-          </w:tcPr>
-          <w:p>
-            <w:r>
-              <w:t>16164 points on 15 reference ground tracks</w:t>
-            </w:r>
-          </w:p>
-        </w:tc>
-        <w:tc>
-          <w:tcPr>
-            <w:tcW w:type="dxa" w:w="1440"/>
-          </w:tcPr>
-          <w:p>
-            <w:r>
-              <w:t>SUPPORTED</w:t>
+              <w:t>3 SWOT nodes on the date</w:t>
             </w:r>
           </w:p>
         </w:tc>
@@ -1870,235 +1452,31 @@
       <w:tr>
         <w:tc>
           <w:tcPr>
-            <w:tcW w:type="dxa" w:w="1440"/>
+            <w:tcW w:type="dxa" w:w="2880"/>
           </w:tcPr>
           <w:p>
             <w:r>
-              <w:t>B4.2a</w:t>
+              <w:t>Rise above the pre-breach surface, 15 km below the dam</w:t>
             </w:r>
           </w:p>
         </w:tc>
         <w:tc>
           <w:tcPr>
-            <w:tcW w:type="dxa" w:w="1440"/>
+            <w:tcW w:type="dxa" w:w="2880"/>
           </w:tcPr>
           <w:p>
             <w:r>
-              <w:t>Error of the reconstructed bed within 250 m of a sounding.</w:t>
+              <w:t>rise 9.10 m at 15 km (peak 10.24 m on 2023-06-07)</w:t>
             </w:r>
           </w:p>
         </w:tc>
         <w:tc>
           <w:tcPr>
-            <w:tcW w:type="dxa" w:w="1440"/>
+            <w:tcW w:type="dxa" w:w="2880"/>
           </w:tcPr>
           <w:p>
             <w:r>
-              <w:t>RMSE 1.535 m, bias +0.291 m</w:t>
-            </w:r>
-          </w:p>
-        </w:tc>
-        <w:tc>
-          <w:tcPr>
-            <w:tcW w:type="dxa" w:w="1440"/>
-          </w:tcPr>
-          <w:p/>
-        </w:tc>
-        <w:tc>
-          <w:tcPr>
-            <w:tcW w:type="dxa" w:w="1440"/>
-          </w:tcPr>
-          <w:p>
-            <w:r>
-              <w:t>7992 points</w:t>
-            </w:r>
-          </w:p>
-        </w:tc>
-        <w:tc>
-          <w:tcPr>
-            <w:tcW w:type="dxa" w:w="1440"/>
-          </w:tcPr>
-          <w:p>
-            <w:r>
-              <w:t>SUPPORTED</w:t>
-            </w:r>
-          </w:p>
-        </w:tc>
-      </w:tr>
-      <w:tr>
-        <w:tc>
-          <w:tcPr>
-            <w:tcW w:type="dxa" w:w="1440"/>
-          </w:tcPr>
-          <w:p>
-            <w:r>
-              <w:t>B4.2</w:t>
-            </w:r>
-          </w:p>
-        </w:tc>
-        <w:tc>
-          <w:tcPr>
-            <w:tcW w:type="dxa" w:w="1440"/>
-          </w:tcPr>
-          <w:p>
-            <w:r>
-              <w:t>The error of the reconstructed bed grows with distance from the nearest sounding, which is the support the interpolation actually had.</w:t>
-            </w:r>
-          </w:p>
-        </w:tc>
-        <w:tc>
-          <w:tcPr>
-            <w:tcW w:type="dxa" w:w="1440"/>
-          </w:tcPr>
-          <w:p>
-            <w:r>
-              <w:t>RMSE 2.48 m beyond 2 km from a sounding</w:t>
-            </w:r>
-          </w:p>
-        </w:tc>
-        <w:tc>
-          <w:tcPr>
-            <w:tcW w:type="dxa" w:w="1440"/>
-          </w:tcPr>
-          <w:p/>
-        </w:tc>
-        <w:tc>
-          <w:tcPr>
-            <w:tcW w:type="dxa" w:w="1440"/>
-          </w:tcPr>
-          <w:p>
-            <w:r>
-              <w:t>42 points</w:t>
-            </w:r>
-          </w:p>
-        </w:tc>
-        <w:tc>
-          <w:tcPr>
-            <w:tcW w:type="dxa" w:w="1440"/>
-          </w:tcPr>
-          <w:p>
-            <w:r>
-              <w:t>SUPPORTED</w:t>
-            </w:r>
-          </w:p>
-        </w:tc>
-      </w:tr>
-      <w:tr>
-        <w:tc>
-          <w:tcPr>
-            <w:tcW w:type="dxa" w:w="1440"/>
-          </w:tcPr>
-          <w:p>
-            <w:r>
-              <w:t>B4.3</w:t>
-            </w:r>
-          </w:p>
-        </w:tc>
-        <w:tc>
-          <w:tcPr>
-            <w:tcW w:type="dxa" w:w="1440"/>
-          </w:tcPr>
-          <w:p>
-            <w:r>
-              <w:t>FABDEM, reduced to EVRF2019 and sampled on stable bare land, agrees with ICESat-2 to within a decimetre, which bounds the datum error of the terrain the bed is seamed into.</w:t>
-            </w:r>
-          </w:p>
-        </w:tc>
-        <w:tc>
-          <w:tcPr>
-            <w:tcW w:type="dxa" w:w="1440"/>
-          </w:tcPr>
-          <w:p>
-            <w:r>
-              <w:t>bias -0.164 m, NMAD 0.267 m</w:t>
-            </w:r>
-          </w:p>
-        </w:tc>
-        <w:tc>
-          <w:tcPr>
-            <w:tcW w:type="dxa" w:w="1440"/>
-          </w:tcPr>
-          <w:p/>
-        </w:tc>
-        <w:tc>
-          <w:tcPr>
-            <w:tcW w:type="dxa" w:w="1440"/>
-          </w:tcPr>
-          <w:p>
-            <w:r>
-              <w:t>196357 points</w:t>
-            </w:r>
-          </w:p>
-        </w:tc>
-        <w:tc>
-          <w:tcPr>
-            <w:tcW w:type="dxa" w:w="1440"/>
-          </w:tcPr>
-          <w:p>
-            <w:r>
-              <w:t>SUPPORTED</w:t>
-            </w:r>
-          </w:p>
-        </w:tc>
-      </w:tr>
-      <w:tr>
-        <w:tc>
-          <w:tcPr>
-            <w:tcW w:type="dxa" w:w="1440"/>
-          </w:tcPr>
-          <w:p>
-            <w:r>
-              <w:t>B7.1</w:t>
-            </w:r>
-          </w:p>
-        </w:tc>
-        <w:tc>
-          <w:tcPr>
-            <w:tcW w:type="dxa" w:w="1440"/>
-          </w:tcPr>
-          <w:p>
-            <w:r>
-              <w:t>The seamless terrain delivered as the companion paper's model input is accuracy-assessed against night-time ICESat-2 returns over the whole domain.</w:t>
-            </w:r>
-          </w:p>
-        </w:tc>
-        <w:tc>
-          <w:tcPr>
-            <w:tcW w:type="dxa" w:w="1440"/>
-          </w:tcPr>
-          <w:p>
-            <w:r>
-              <w:t>RMSE 1.092 m, LE90 1.036 m, NMAD 0.389 m</w:t>
-            </w:r>
-          </w:p>
-        </w:tc>
-        <w:tc>
-          <w:tcPr>
-            <w:tcW w:type="dxa" w:w="1440"/>
-          </w:tcPr>
-          <w:p>
-            <w:r>
-              <w:t>LE95 1.792 m</w:t>
-            </w:r>
-          </w:p>
-        </w:tc>
-        <w:tc>
-          <w:tcPr>
-            <w:tcW w:type="dxa" w:w="1440"/>
-          </w:tcPr>
-          <w:p>
-            <w:r>
-              <w:t>841752 night points</w:t>
-            </w:r>
-          </w:p>
-        </w:tc>
-        <w:tc>
-          <w:tcPr>
-            <w:tcW w:type="dxa" w:w="1440"/>
-          </w:tcPr>
-          <w:p>
-            <w:r>
-              <w:t>SUPPORTED</w:t>
+              <w:t>48 nodes in the bin</w:t>
             </w:r>
           </w:p>
         </w:tc>
@@ -2111,84 +1489,36 @@
         <w:jc w:val="both"/>
       </w:pPr>
       <w:r>
-        <w:t>На рисунку 13  показано як залежність від опорних даних, так і стабільність залежно від епохи, сезону та зони спрацювання.</w:t>
+        <w:rPr>
+          <w:i/>
+        </w:rPr>
+        <w:t>Кількість вузлів на дату є невеликою; цей ряд є послідовністю спостережуваних поверхонь, а не гідрографом, отриманим за даними гідрологічного поста.</w:t>
       </w:r>
     </w:p>
     <w:p>
       <w:pPr>
-        <w:pStyle w:val="Heading1"/>
-      </w:pPr>
-      <w:r>
-        <w:t>5.9.2 The datum of the surrounding terrain</w:t>
+        <w:spacing w:line="360" w:lineRule="auto"/>
+        <w:jc w:val="both"/>
+      </w:pPr>
+      <w:r>
+        <w:t>На рисунку 15  показано ряд значень на виході відносно гідрологічного поста вище за течією та профіль підйому рівня води нижче за течією.</w:t>
       </w:r>
     </w:p>
     <w:p>
       <w:pPr>
+        <w:pStyle w:val="Heading1"/>
+      </w:pPr>
+      <w:r>
+        <w:t>6.3 Post-breach longitudinal gradient</w:t>
+      </w:r>
+    </w:p>
+    <w:p>
+      <w:pPr>
         <w:spacing w:line="360" w:lineRule="auto"/>
         <w:jc w:val="both"/>
       </w:pPr>
       <w:r>
-        <w:t>Дно зшите з FABDEM для суходолу вище ватерлінії, тому вони повинні мати спільний рівень відліку. При вибірці на стабільній оголеній ділянці суходолу відносно того самого кадру ICESat-2 , FABDEM демонструє зміщення -0.164 m, NMAD 0.267 m (n = 196357  точок), що є дециметровим зсувом на порядок меншим за похибку дна.</w:t>
-      </w:r>
-    </w:p>
-    <w:p>
-      <w:pPr>
-        <w:pStyle w:val="Heading1"/>
-      </w:pPr>
-      <w:r>
-        <w:t>5.10 Area-weighted exposure</w:t>
-      </w:r>
-    </w:p>
-    <w:p>
-      <w:pPr>
-        <w:spacing w:line="360" w:lineRule="auto"/>
-        <w:jc w:val="both"/>
-      </w:pPr>
-      <w:r>
-        <w:t>усе картографоване водосховище: історичне 12.9% проти реконструйованого 12.77% (різниця -0.18 pp) (за інтерполяторами 12.61-13.29% (розкид 0.68 pp); за ділянками історичне 3.9 / 9.4 / 26.0 % проти реконструйованого 7.5 / 9.3 / 21.7 %). Історична частка використовувалася як валідація, а не калібрування. Реконструйоване дно також відтворює опубліковану криву залежності рівня від площі (СКП (RMSE) площі 74 km2 (3.8% від середньої площі); медіана +1.7%), а частка оголеного дна збігається з роздільною здатністю сітки (250 m -&gt; 12.77%; 50 m -&gt; 12.79%; 30 m -&gt; 12.79%).</w:t>
-      </w:r>
-    </w:p>
-    <w:p>
-      <w:pPr>
-        <w:pStyle w:val="Heading1"/>
-      </w:pPr>
-      <w:r>
-        <w:t>5.11 Downstream zone beds</w:t>
-      </w:r>
-    </w:p>
-    <w:p>
-      <w:pPr>
-        <w:spacing w:line="360" w:lineRule="auto"/>
-        <w:jc w:val="both"/>
-      </w:pPr>
-      <w:r>
-        <w:t>У дельті, естуарії та заплаві метод лише промірів глибин (soundings-only) переважає в кожній зоні: SND_ONLY / LINEAR: RMSE 2.31 m, зміщення +0.02 m, NMAD 1.67 m; SND_ONLY / OK: RMSE 2.62 m, зміщення +0.04 m, NMAD 2.27 m; SND_ONLY / LINEAR: RMSE 2.20 m, зміщення -0.07 m, NMAD 1.24 m. М'які обмеження берегової лінії та псевдоточки додають додатне зміщення метрового масштабу там, де прибережна смуга містить більшість промірів глибин.</w:t>
-      </w:r>
-    </w:p>
-    <w:p>
-      <w:pPr>
-        <w:spacing w:line="360" w:lineRule="auto"/>
-        <w:jc w:val="both"/>
-      </w:pPr>
-      <w:r>
-        <w:t>Підтримка, а не метод, визначає значення цих чисел: в естуарії СКП (RMSE) 2.61 m понад 3342 km², 20.2% з яких підтверджено промірами глибин (Лише п'ята частина естуарію охоплена промірами глибин; решта даних базується на батиметрії EMODnet і не є незалежно валідованою в цій роботі).</w:t>
-      </w:r>
-    </w:p>
-    <w:p>
-      <w:pPr>
-        <w:pStyle w:val="Heading1"/>
-      </w:pPr>
-      <w:r>
-        <w:t>5.11.1 The terrain delivered to the companion paper</w:t>
-      </w:r>
-    </w:p>
-    <w:p>
-      <w:pPr>
-        <w:spacing w:line="360" w:lineRule="auto"/>
-        <w:jc w:val="both"/>
-      </w:pPr>
-      <w:r>
-        <w:t>Дно, поверхні нижньої зони та FABDEM об’єднані в один безшовний рельєф, який є об’єктом, на якому базуються гідравлічні моделі супровідної статті. За результатами нічних вимірювань ICESat-2  по всій області дослідження досягнуто СКП (RMSE) 1.092 m, LE90 1.036 m, NMAD 0.389 m (LE95 1.792 m; n = 841752  нічних точок). Цей показник є середнім значенням для різних типів земного покриву, які поводяться по-різному (точність сильно залежить від типу земного покриву: СКП (RMSE) для ріллі становить 0.52 m порівняно з 3.16 m під деревною рослинністю, де залишковий показник є помилкою крони, а не рельєфу. Узагальнена цифра також приховує дефект стику, якого не досягають нічні точки (B8.2)), і саме розподіл за класами, а не узагальнена статистика, є необхідним для моделювальника.</w:t>
+        <w:t>Для 14 прольотів до прориву греблі та 14 прольотів після прориву греблі з пікетажем щонайменше 20 km, медіанний ухил за оцінювачем Тейла–Сена для кожного прольоту змінився з +0.090 cm/km до -&gt; +3.314 cm/km; різниця +3.223 cm/km; різниця має 95 % бутстреп-довірчий інтервал 95% CI [+1.994, +5.071] см/км; перестановочний тест p = 1.00e-04; тест Манна–Вітні p = 3.92e-05; додатні ухили до 10/14  (знаковий тест p = 0.180) проти після 14/14  (p = 1.22e-04). Кожен із 14 прольотів після прориву греблі є додатним. Результат є стійким до вибору оцінювача: метод найменших квадратів дає OLS +0.038 -&gt; +2.781 cm/km, різниця +2.744 cm/km (95% CI [+1.454, +4.323]; перестановочний тест p = 3.00e-04). Кожен ухил для прольоту — це апроксимація через шість точок медіан променів одного прольоту над приблизно 20–70 km осьової лінії водосховища; твердження стосується розподілу цих локальних ухилів за датами, а не єдиного градієнта всього водосховища.</w:t>
       </w:r>
     </w:p>
     <w:p>
@@ -2200,7 +1530,7 @@
         <w:rPr>
           <w:b/>
         </w:rPr>
-        <w:t>Table 7. Крос-валідація поверхні дна та невизначеність берегової лінії за зонами.</w:t>
+        <w:t>Table 3. Геометрія водної поверхні до та після прориву греблі.</w:t>
       </w:r>
     </w:p>
     <w:tbl>
@@ -2211,75 +1541,61 @@
         <w:tblLook w:firstColumn="1" w:firstRow="1" w:lastColumn="0" w:lastRow="0" w:noHBand="0" w:noVBand="1" w:val="04A0"/>
       </w:tblPr>
       <w:tblGrid>
-        <w:gridCol w:w="1728"/>
-        <w:gridCol w:w="1728"/>
-        <w:gridCol w:w="1728"/>
-        <w:gridCol w:w="1728"/>
-        <w:gridCol w:w="1728"/>
+        <w:gridCol w:w="2160"/>
+        <w:gridCol w:w="2160"/>
+        <w:gridCol w:w="2160"/>
+        <w:gridCol w:w="2160"/>
       </w:tblGrid>
       <w:tr>
         <w:tc>
           <w:tcPr>
-            <w:tcW w:type="dxa" w:w="1728"/>
+            <w:tcW w:type="dxa" w:w="2160"/>
           </w:tcPr>
           <w:p>
             <w:r>
               <w:rPr>
                 <w:b/>
               </w:rPr>
-              <w:t>claim_id</w:t>
+              <w:t>Quantity</w:t>
             </w:r>
           </w:p>
         </w:tc>
         <w:tc>
           <w:tcPr>
-            <w:tcW w:type="dxa" w:w="1728"/>
+            <w:tcW w:type="dxa" w:w="2160"/>
           </w:tcPr>
           <w:p>
             <w:r>
               <w:rPr>
                 <w:b/>
               </w:rPr>
-              <w:t>claim_text</w:t>
+              <w:t>Pre → post</w:t>
             </w:r>
           </w:p>
         </w:tc>
         <w:tc>
           <w:tcPr>
-            <w:tcW w:type="dxa" w:w="1728"/>
+            <w:tcW w:type="dxa" w:w="2160"/>
           </w:tcPr>
           <w:p>
             <w:r>
               <w:rPr>
                 <w:b/>
               </w:rPr>
-              <w:t>value_resolved</w:t>
+              <w:t>Uncertainty</w:t>
             </w:r>
           </w:p>
         </w:tc>
         <w:tc>
           <w:tcPr>
-            <w:tcW w:type="dxa" w:w="1728"/>
+            <w:tcW w:type="dxa" w:w="2160"/>
           </w:tcPr>
           <w:p>
             <w:r>
               <w:rPr>
                 <w:b/>
               </w:rPr>
-              <w:t>n_resolved</w:t>
-            </w:r>
-          </w:p>
-        </w:tc>
-        <w:tc>
-          <w:tcPr>
-            <w:tcW w:type="dxa" w:w="1728"/>
-          </w:tcPr>
-          <w:p>
-            <w:r>
-              <w:rPr>
-                <w:b/>
-              </w:rPr>
-              <w:t>audit_status</w:t>
+              <w:t>n</w:t>
             </w:r>
           </w:p>
         </w:tc>
@@ -2287,51 +1603,41 @@
       <w:tr>
         <w:tc>
           <w:tcPr>
-            <w:tcW w:type="dxa" w:w="1728"/>
+            <w:tcW w:type="dxa" w:w="2160"/>
           </w:tcPr>
           <w:p>
             <w:r>
-              <w:t>V10.3</w:t>
+              <w:t>Per-overpass longitudinal slope, footprint-wide</w:t>
             </w:r>
           </w:p>
         </w:tc>
         <w:tc>
           <w:tcPr>
-            <w:tcW w:type="dxa" w:w="1728"/>
+            <w:tcW w:type="dxa" w:w="2160"/>
           </w:tcPr>
           <w:p>
             <w:r>
-              <w:t>Interpolation uncertainty, not grid resolution, is the limiting term in the bed surface. The median absolute prediction error is ~0.9 m, while RMSE rises to 2.76 m because of a small number of large errors concentrated i</w:t>
+              <w:t>Theil-Sen median +0.090 cm/km pre -&gt; +3.314 cm/km post; difference +3.223 cm/km</w:t>
             </w:r>
           </w:p>
         </w:tc>
         <w:tc>
           <w:tcPr>
-            <w:tcW w:type="dxa" w:w="1728"/>
+            <w:tcW w:type="dxa" w:w="2160"/>
           </w:tcPr>
           <w:p>
             <w:r>
-              <w:t>preferred OK: RMSE 2.76 m, NMAD 1.32 m, bias -0.03 m, median /e/ 0.89 m</w:t>
+              <w:t>95% CI [+1.994, +5.071] cm/km; permutation p = 1.00e-04; Mann-Whitney p = 3.92e-05; positive slopes pre 10/14 (sign test p = 0.180) vs post 14/14 (p = 1.22e-04)</w:t>
             </w:r>
           </w:p>
         </w:tc>
         <w:tc>
           <w:tcPr>
-            <w:tcW w:type="dxa" w:w="1728"/>
+            <w:tcW w:type="dxa" w:w="2160"/>
           </w:tcPr>
           <w:p>
             <w:r>
-              <w:t>7509</w:t>
-            </w:r>
-          </w:p>
-        </w:tc>
-        <w:tc>
-          <w:tcPr>
-            <w:tcW w:type="dxa" w:w="1728"/>
-          </w:tcPr>
-          <w:p>
-            <w:r>
-              <w:t>SUPPORTED</w:t>
+              <w:t>14 pre / 14 post</w:t>
             </w:r>
           </w:p>
         </w:tc>
@@ -2339,835 +1645,17 @@
       <w:tr>
         <w:tc>
           <w:tcPr>
-            <w:tcW w:type="dxa" w:w="1728"/>
+            <w:tcW w:type="dxa" w:w="2160"/>
           </w:tcPr>
           <w:p>
             <w:r>
-              <w:t>V10.4</w:t>
+              <w:t>Slope in the first passes after drainage</w:t>
             </w:r>
           </w:p>
         </w:tc>
         <w:tc>
           <w:tcPr>
-            <w:tcW w:type="dxa" w:w="1728"/>
-          </w:tcPr>
-          <w:p>
-            <w:r>
-              <w:t>The 2.76 m blocked-CV RMSE is a heavy-tailed error of local bed morphology, not a vertical offset of the DEM and not an artefact of blocked cross-validation.</w:t>
-            </w:r>
-          </w:p>
-        </w:tc>
-        <w:tc>
-          <w:tcPr>
-            <w:tcW w:type="dxa" w:w="1728"/>
-          </w:tcPr>
-          <w:p>
-            <w:r>
-              <w:t>random hold-out already gives 2.648 m; 1 km blocking adds only 1.04x (2.761 m) and 5 km blocking 1.20x</w:t>
-            </w:r>
-          </w:p>
-        </w:tc>
-        <w:tc>
-          <w:tcPr>
-            <w:tcW w:type="dxa" w:w="1728"/>
-          </w:tcPr>
-          <w:p>
-            <w:r>
-              <w:t>7509</w:t>
-            </w:r>
-          </w:p>
-        </w:tc>
-        <w:tc>
-          <w:tcPr>
-            <w:tcW w:type="dxa" w:w="1728"/>
-          </w:tcPr>
-          <w:p>
-            <w:r>
-              <w:t>SUPPORTED</w:t>
-            </w:r>
-          </w:p>
-        </w:tc>
-      </w:tr>
-      <w:tr>
-        <w:tc>
-          <w:tcPr>
-            <w:tcW w:type="dxa" w:w="1728"/>
-          </w:tcPr>
-          <w:p>
-            <w:r>
-              <w:t>B2.1</w:t>
-            </w:r>
-          </w:p>
-        </w:tc>
-        <w:tc>
-          <w:tcPr>
-            <w:tcW w:type="dxa" w:w="1728"/>
-          </w:tcPr>
-          <w:p>
-            <w:r>
-              <w:t>ZONE_2 (Kherson delta) pre-breach bed: soundings-only interpolation is the selected arm.</w:t>
-            </w:r>
-          </w:p>
-        </w:tc>
-        <w:tc>
-          <w:tcPr>
-            <w:tcW w:type="dxa" w:w="1728"/>
-          </w:tcPr>
-          <w:p>
-            <w:r>
-              <w:t>SND_ONLY / LINEAR: RMSE 2.31 m, bias +0.02 m, NMAD 1.67 m</w:t>
-            </w:r>
-          </w:p>
-        </w:tc>
-        <w:tc>
-          <w:tcPr>
-            <w:tcW w:type="dxa" w:w="1728"/>
-          </w:tcPr>
-          <w:p>
-            <w:r>
-              <w:t>527 soundings; 17271 S2 shoreline constraints offered; canonical 181 km²</w:t>
-            </w:r>
-          </w:p>
-        </w:tc>
-        <w:tc>
-          <w:tcPr>
-            <w:tcW w:type="dxa" w:w="1728"/>
-          </w:tcPr>
-          <w:p>
-            <w:r>
-              <w:t>SUPPORTED_WITH_LIMITATION</w:t>
-            </w:r>
-          </w:p>
-        </w:tc>
-      </w:tr>
-      <w:tr>
-        <w:tc>
-          <w:tcPr>
-            <w:tcW w:type="dxa" w:w="1728"/>
-          </w:tcPr>
-          <w:p>
-            <w:r>
-              <w:t>B2.2</w:t>
-            </w:r>
-          </w:p>
-        </w:tc>
-        <w:tc>
-          <w:tcPr>
-            <w:tcW w:type="dxa" w:w="1728"/>
-          </w:tcPr>
-          <w:p>
-            <w:r>
-              <w:t>ZONE_3 (Dnipro–Buh estuary) pre-breach bed.</w:t>
-            </w:r>
-          </w:p>
-        </w:tc>
-        <w:tc>
-          <w:tcPr>
-            <w:tcW w:type="dxa" w:w="1728"/>
-          </w:tcPr>
-          <w:p>
-            <w:r>
-              <w:t>SND_ONLY / OK: RMSE 2.62 m, bias +0.04 m, NMAD 2.27 m</w:t>
-            </w:r>
-          </w:p>
-        </w:tc>
-        <w:tc>
-          <w:tcPr>
-            <w:tcW w:type="dxa" w:w="1728"/>
-          </w:tcPr>
-          <w:p>
-            <w:r>
-              <w:t>634 soundings; canonical 728 km²</w:t>
-            </w:r>
-          </w:p>
-        </w:tc>
-        <w:tc>
-          <w:tcPr>
-            <w:tcW w:type="dxa" w:w="1728"/>
-          </w:tcPr>
-          <w:p>
-            <w:r>
-              <w:t>SUPPORTED_WITH_LIMITATION</w:t>
-            </w:r>
-          </w:p>
-        </w:tc>
-      </w:tr>
-      <w:tr>
-        <w:tc>
-          <w:tcPr>
-            <w:tcW w:type="dxa" w:w="1728"/>
-          </w:tcPr>
-          <w:p>
-            <w:r>
-              <w:t>B2.3</w:t>
-            </w:r>
-          </w:p>
-        </w:tc>
-        <w:tc>
-          <w:tcPr>
-            <w:tcW w:type="dxa" w:w="1728"/>
-          </w:tcPr>
-          <w:p>
-            <w:r>
-              <w:t>ZONE_4 (dam-to-Kherson floodway) pre-breach bed.</w:t>
-            </w:r>
-          </w:p>
-        </w:tc>
-        <w:tc>
-          <w:tcPr>
-            <w:tcW w:type="dxa" w:w="1728"/>
-          </w:tcPr>
-          <w:p>
-            <w:r>
-              <w:t>SND_ONLY / LINEAR: RMSE 2.20 m, bias -0.07 m, NMAD 1.24 m</w:t>
-            </w:r>
-          </w:p>
-        </w:tc>
-        <w:tc>
-          <w:tcPr>
-            <w:tcW w:type="dxa" w:w="1728"/>
-          </w:tcPr>
-          <w:p>
-            <w:r>
-              <w:t>626 soundings; 2110 p18 pseudo-points offered; canonical 101 km²</w:t>
-            </w:r>
-          </w:p>
-        </w:tc>
-        <w:tc>
-          <w:tcPr>
-            <w:tcW w:type="dxa" w:w="1728"/>
-          </w:tcPr>
-          <w:p>
-            <w:r>
-              <w:t>SUPPORTED_WITH_LIMITATION</w:t>
-            </w:r>
-          </w:p>
-        </w:tc>
-      </w:tr>
-      <w:tr>
-        <w:tc>
-          <w:tcPr>
-            <w:tcW w:type="dxa" w:w="1728"/>
-          </w:tcPr>
-          <w:p>
-            <w:r>
-              <w:t>B6.1</w:t>
-            </w:r>
-          </w:p>
-        </w:tc>
-        <w:tc>
-          <w:tcPr>
-            <w:tcW w:type="dxa" w:w="1728"/>
-          </w:tcPr>
-          <w:p>
-            <w:r>
-              <w:t>The downstream zone beds are reconstructed on the same rules; their blocked cross-validation error and the share of area actually supported by soundings are reported together, because the second governs the first.</w:t>
-            </w:r>
-          </w:p>
-        </w:tc>
-        <w:tc>
-          <w:tcPr>
-            <w:tcW w:type="dxa" w:w="1728"/>
-          </w:tcPr>
-          <w:p>
-            <w:r>
-              <w:t>CV RMSE 2.61 m over 3342 km², 20.2% of it sounding-supported</w:t>
-            </w:r>
-          </w:p>
-        </w:tc>
-        <w:tc>
-          <w:tcPr>
-            <w:tcW w:type="dxa" w:w="1728"/>
-          </w:tcPr>
-          <w:p>
-            <w:r>
-              <w:t>634 soundings, 16438 EMODnet points</w:t>
-            </w:r>
-          </w:p>
-        </w:tc>
-        <w:tc>
-          <w:tcPr>
-            <w:tcW w:type="dxa" w:w="1728"/>
-          </w:tcPr>
-          <w:p>
-            <w:r>
-              <w:t>SUPPORTED_WITH_LIMITATION</w:t>
-            </w:r>
-          </w:p>
-        </w:tc>
-      </w:tr>
-      <w:tr>
-        <w:tc>
-          <w:tcPr>
-            <w:tcW w:type="dxa" w:w="1728"/>
-          </w:tcPr>
-          <w:p>
-            <w:r>
-              <w:t>B3.1</w:t>
-            </w:r>
-          </w:p>
-        </w:tc>
-        <w:tc>
-          <w:tcPr>
-            <w:tcW w:type="dxa" w:w="1728"/>
-          </w:tcPr>
-          <w:p>
-            <w:r>
-              <w:t>The SAR–optical shoreline offset is not a single constant, so the multi-level contour bathymetry experiment (hist21–hist31) cannot be promoted.</w:t>
-            </w:r>
-          </w:p>
-        </w:tc>
-        <w:tc>
-          <w:tcPr>
-            <w:tcW w:type="dxa" w:w="1728"/>
-          </w:tcPr>
-          <w:p>
-            <w:r>
-              <w:t>verdict NO_CONSTANT: between-scene spread 50.2 m vs within-scene NMAD 22.1 m (ratio 2.27); central offset -3.7 m</w:t>
-            </w:r>
-          </w:p>
-        </w:tc>
-        <w:tc>
-          <w:tcPr>
-            <w:tcW w:type="dxa" w:w="1728"/>
-          </w:tcPr>
-          <w:p/>
-        </w:tc>
-        <w:tc>
-          <w:tcPr>
-            <w:tcW w:type="dxa" w:w="1728"/>
-          </w:tcPr>
-          <w:p>
-            <w:r>
-              <w:t>SUPPORTED</w:t>
-            </w:r>
-          </w:p>
-        </w:tc>
-      </w:tr>
-      <w:tr>
-        <w:tc>
-          <w:tcPr>
-            <w:tcW w:type="dxa" w:w="1728"/>
-          </w:tcPr>
-          <w:p>
-            <w:r>
-              <w:t>B3.2</w:t>
-            </w:r>
-          </w:p>
-        </w:tc>
-        <w:tc>
-          <w:tcPr>
-            <w:tcW w:type="dxa" w:w="1728"/>
-          </w:tcPr>
-          <w:p>
-            <w:r>
-              <w:t>Only the H3 (14.2 m) contour has direct sounding support; no stage is licensed for cross-stage transfer.</w:t>
-            </w:r>
-          </w:p>
-        </w:tc>
-        <w:tc>
-          <w:tcPr>
-            <w:tcW w:type="dxa" w:w="1728"/>
-          </w:tcPr>
-          <w:p>
-            <w:r>
-              <w:t>H3 14.23 m: σ_sensor 21.2 m, σ_reference 87.2 m, σ_total 89.8 m; ABSOLUTE_COMMON_MODE_EXCLUDED; transfer licensed False</w:t>
-            </w:r>
-          </w:p>
-        </w:tc>
-        <w:tc>
-          <w:tcPr>
-            <w:tcW w:type="dxa" w:w="1728"/>
-          </w:tcPr>
-          <w:p>
-            <w:r>
-              <w:t>512 bracketing triangles, 55.1 km supported</w:t>
-            </w:r>
-          </w:p>
-        </w:tc>
-        <w:tc>
-          <w:tcPr>
-            <w:tcW w:type="dxa" w:w="1728"/>
-          </w:tcPr>
-          <w:p>
-            <w:r>
-              <w:t>SUPPORTED</w:t>
-            </w:r>
-          </w:p>
-        </w:tc>
-      </w:tr>
-      <w:tr>
-        <w:tc>
-          <w:tcPr>
-            <w:tcW w:type="dxa" w:w="1728"/>
-          </w:tcPr>
-          <w:p>
-            <w:r>
-              <w:t>I1.1</w:t>
-            </w:r>
-          </w:p>
-        </w:tc>
-        <w:tc>
-          <w:tcPr>
-            <w:tcW w:type="dxa" w:w="1728"/>
-          </w:tcPr>
-          <w:p>
-            <w:r>
-              <w:t>Shoreline elevation uncertainty budget for ZONE_2 from Sentinel-1 contours.</w:t>
-            </w:r>
-          </w:p>
-        </w:tc>
-        <w:tc>
-          <w:tcPr>
-            <w:tcW w:type="dxa" w:w="1728"/>
-          </w:tcPr>
-          <w:p>
-            <w:r>
-              <w:t>σ_total 0.193 m (σ_9902 0.068, σ_level_spread 0.11, σ_wind 0.09–0.09); reed-adjacent fraction 0.84</w:t>
-            </w:r>
-          </w:p>
-        </w:tc>
-        <w:tc>
-          <w:tcPr>
-            <w:tcW w:type="dxa" w:w="1728"/>
-          </w:tcPr>
-          <w:p>
-            <w:r>
-              <w:t>10 dates, 872 km shoreline, 8692 vertices</w:t>
-            </w:r>
-          </w:p>
-        </w:tc>
-        <w:tc>
-          <w:tcPr>
-            <w:tcW w:type="dxa" w:w="1728"/>
-          </w:tcPr>
-          <w:p>
-            <w:r>
-              <w:t>SUPPORTED_WITH_LIMITATION</w:t>
-            </w:r>
-          </w:p>
-        </w:tc>
-      </w:tr>
-      <w:tr>
-        <w:tc>
-          <w:tcPr>
-            <w:tcW w:type="dxa" w:w="1728"/>
-          </w:tcPr>
-          <w:p>
-            <w:r>
-              <w:t>I1.2</w:t>
-            </w:r>
-          </w:p>
-        </w:tc>
-        <w:tc>
-          <w:tcPr>
-            <w:tcW w:type="dxa" w:w="1728"/>
-          </w:tcPr>
-          <w:p>
-            <w:r>
-              <w:t>Shoreline elevation uncertainty budget for ZONE_4 from Sentinel-1 contours.</w:t>
-            </w:r>
-          </w:p>
-        </w:tc>
-        <w:tc>
-          <w:tcPr>
-            <w:tcW w:type="dxa" w:w="1728"/>
-          </w:tcPr>
-          <w:p>
-            <w:r>
-              <w:t>σ_total 0.375 m; reed-adjacent fraction 0.70</w:t>
-            </w:r>
-          </w:p>
-        </w:tc>
-        <w:tc>
-          <w:tcPr>
-            <w:tcW w:type="dxa" w:w="1728"/>
-          </w:tcPr>
-          <w:p>
-            <w:r>
-              <w:t>11 dates, 1383 km shoreline</w:t>
-            </w:r>
-          </w:p>
-        </w:tc>
-        <w:tc>
-          <w:tcPr>
-            <w:tcW w:type="dxa" w:w="1728"/>
-          </w:tcPr>
-          <w:p>
-            <w:r>
-              <w:t>SUPPORTED_WITH_LIMITATION</w:t>
-            </w:r>
-          </w:p>
-        </w:tc>
-      </w:tr>
-    </w:tbl>
-    <w:p/>
-    <w:p>
-      <w:pPr>
-        <w:spacing w:line="360" w:lineRule="auto"/>
-        <w:jc w:val="both"/>
-      </w:pPr>
-      <w:r>
-        <w:t>На рисунку 14  наведено розподіл об’єднаних даних за класами земного покриву.</w:t>
-      </w:r>
-    </w:p>
-    <w:p>
-      <w:pPr>
-        <w:pStyle w:val="Heading1"/>
-      </w:pPr>
-      <w:r>
-        <w:t>5.11.2 A second lidar on the same terrain</w:t>
-      </w:r>
-    </w:p>
-    <w:p>
-      <w:pPr>
-        <w:spacing w:line="360" w:lineRule="auto"/>
-        <w:jc w:val="both"/>
-      </w:pPr>
-      <w:r>
-        <w:t>ICESat-2  та проміри глибин мають спільне походження — обидва є профілювальними вимірюваннями, зведеними через той самий вертикальний ланцюг, тому перевірка датчиком з іншим розміром променя, іншим методом отримання даних та іншим режимом відмови вартує більше, ніж більша вибірка того самого типу. Наземні відбиття GEDI над оголеним дном дають зміщення -0.673 m, СКП (RMSE) 1.66 m, LE90 2.65 m (NMAD 0.98 m; n = 3404  якісних імпульсів) на страті, побудованій для відповідності нічному порівнянню ICESat-2 . Узгодженість не є безумовною (оцінка поверхні землі за найнижчим модом GEDI розташована приблизно на 0.6 m вище за ICESat-2  під рослинністю, що є відомим додатним зміщенням методу отримання даних, тому узгодженість має той самий порядок, що й це зміщення, а не є незалежною від нього), проте вона досягнута з іншого боку.</w:t>
-      </w:r>
-    </w:p>
-    <w:p>
-      <w:pPr>
-        <w:spacing w:line="360" w:lineRule="auto"/>
-        <w:jc w:val="both"/>
-      </w:pPr>
-      <w:r>
-        <w:t>Цей другий погляд також виявив те, чого не міг виявити перший. При порівнянні з FABDEM як зовнішнім контролем, два класи джерел шва суттєво відхиляються від нього, і це відхилення полягає у самому шві, а не в контролі. Це дефект, а не невизначеність, і він зафіксований як такий у Розділі 7.9 , а не включений до бюджету похибок.</w:t>
-      </w:r>
-    </w:p>
-    <w:p>
-      <w:pPr>
-        <w:pStyle w:val="Heading1"/>
-      </w:pPr>
-      <w:r>
-        <w:t>5.12 Why multi-level contours cannot constrain the shallow bed</w:t>
-      </w:r>
-    </w:p>
-    <w:p>
-      <w:pPr>
-        <w:spacing w:line="360" w:lineRule="auto"/>
-        <w:jc w:val="both"/>
-      </w:pPr>
-      <w:r>
-        <w:t>verdict NO_CONSTANT: between-scene spread 50.2 m vs within-scene NMAD 22.1 m (ratio 2.27); central offset -3.7 m. H3 14.23 m: σ_sensor 21.2 m, σ_reference 87.2 m, σ_total 89.8 m; ABSOLUTE_COMMON_MODE_EXCLUDED; transfer licensed False. Оптична берегова лінія розташована на межі поясу надводної рослинності, а не на межі води та суші, тому сигнал зміни рівня менший за зміщення положення; експеримент класифіковано як негативний результат.</w:t>
-      </w:r>
-    </w:p>
-    <w:p>
-      <w:pPr>
-        <w:pStyle w:val="Heading1"/>
-      </w:pPr>
-      <w:r>
-        <w:t>5.13 Shoreline elevation uncertainty</w:t>
-      </w:r>
-    </w:p>
-    <w:p>
-      <w:pPr>
-        <w:spacing w:line="360" w:lineRule="auto"/>
-        <w:jc w:val="both"/>
-      </w:pPr>
-      <w:r>
-        <w:t>σ_total 0.193 m (σ_9902 0.068, σ_level_spread 0.11, σ_wind 0.09–0.09); частка, прилегла до очерету 0.84. σ_total 0.375 m; частка, прилегла до очерету 0.70.</w:t>
-      </w:r>
-    </w:p>
-    <w:p>
-      <w:pPr>
-        <w:pStyle w:val="Heading1"/>
-      </w:pPr>
-      <w:r>
-        <w:t>5.14 Validation synthesis</w:t>
-      </w:r>
-    </w:p>
-    <w:p>
-      <w:pPr>
-        <w:spacing w:line="360" w:lineRule="auto"/>
-        <w:jc w:val="both"/>
-      </w:pPr>
-      <w:r>
-        <w:t>Перед інтерпретацією будь-яких гідравлічних або поверхневих результатів було виконано шість незалежних перевірок; одна з них (аномалія 5  квітня 2023 ) не була пройдена і зафіксована як така, що не пройшла перевірку. Реконструйоване дно має точність точок, підтверджену крос-валідацією, та валідовану статистику площі; воно не містить показника швидкості зміни та точності понад 250 m, і оприлюднюється із зазначенням цих обмежень.</w:t>
-      </w:r>
-    </w:p>
-    <w:p>
-      <w:pPr>
-        <w:pStyle w:val="Title"/>
-      </w:pPr>
-      <w:r>
-        <w:t>6. HYDRAULIC TRANSITION RESULTS</w:t>
-      </w:r>
-    </w:p>
-    <w:p>
-      <w:pPr>
-        <w:pStyle w:val="Heading1"/>
-      </w:pPr>
-      <w:r>
-        <w:t>6.1 Pre-breach water-surface geometry</w:t>
-      </w:r>
-    </w:p>
-    <w:p>
-      <w:pPr>
-        <w:spacing w:line="360" w:lineRule="auto"/>
-        <w:jc w:val="both"/>
-      </w:pPr>
-      <w:r>
-        <w:t>До прориву греблі водойма перебувала майже на горизонтальному рівні. Ухили водної поверхні за окремими ділянками згідно з ICESat-2  (0-180 km: +0.00, -0.06, +0.06 cm/km; 210-240 km: +0.13 cm/km) лежать у межах історичного діапазону витрат води, наведеного в проектних таблицях, а крива вільної поверхні, виміряна в польових умовах 22–25  квітня 1970  року, оцифрована та перевірена за Таблицею 20  (медіанне відхилення +0.022 m; NMAD 0.045 m), обмежує їх зверху. Видимий ухил у смузі 180–210 km є артефактом геометрії пікетажу, а не гідравлічним сигналом (усі апроксимації в межах смуги отримані за допомогою одного прольоту; медіана відношення довжини пікетажу до довжини на місцевості становить 1.34  (p90 1.94, max 2.65)).</w:t>
-      </w:r>
-    </w:p>
-    <w:p>
-      <w:pPr>
-        <w:pStyle w:val="Heading1"/>
-      </w:pPr>
-      <w:r>
-        <w:t>6.2 Drawdown</w:t>
-      </w:r>
-    </w:p>
-    <w:p>
-      <w:pPr>
-        <w:spacing w:line="360" w:lineRule="auto"/>
-        <w:jc w:val="both"/>
-      </w:pPr>
-      <w:r>
-        <w:t>П'ять прольотів за липень–вересень 2023  вже відображають градієнт після прориву греблі: медіана Тейла–Сена +3.245 cm/km (2023-07-07..2023-09-07) (n = 5). Таким чином, структурні зміни помітні вже під час самого перехідного процесу дренажу, а не лише після стабілізації системи.</w:t>
-      </w:r>
-    </w:p>
-    <w:p>
-      <w:pPr>
-        <w:pStyle w:val="Heading1"/>
-      </w:pPr>
-      <w:r>
-        <w:t>6.2.1 The drawdown and the flood wave from orbit</w:t>
-      </w:r>
-    </w:p>
-    <w:p>
-      <w:pPr>
-        <w:spacing w:line="360" w:lineRule="auto"/>
-        <w:jc w:val="both"/>
-      </w:pPr>
-      <w:r>
-        <w:t>Те, що місія SWOT зафіксувала цю подію, не є новим спостереженням: повінь нижче греблі вже була описана за даними тієї ж місії та використана для тестування моделей паводків від прориву греблі ((Lehnigk et al., 2026)). Новизна цього дослідження полягає у самому витоку, представленому в тій же вертикальній системі відліку, що й гідрологічні пости та дно. Оскільки калібрувальна орбіта проходила над витоком щодня, спорожнення водойми було зафіксовано безпосередньо, а не виведено шляхом розрахунків: витік 5.63 m EVRF2019  станом на 13  червня, порівняно з 17.53 m станом на 31  травня (n = 3  вузлів SWOT на дату). Нижче греблі ті самі проходи описують хвилю, що переносила цю воду, з підйомом 9.10 m о 15 km (пік 10.24 m о 2023-06-07) та спадом вниз за течією приблизно до двох метрів до 80 km. Обидва ряди є знімками з кількох вузлів на дату (кількість вузлів на дату невелика (1-3), а деякі дати базуються на одному вузлі; ряд є послідовністю знімків, а не виміряним гідрографом), тому їх слід розглядати як послідовність спостережуваних висот водної поверхні, а не як гідрограф.</w:t>
-      </w:r>
-    </w:p>
-    <w:p>
-      <w:pPr>
-        <w:spacing w:line="360" w:lineRule="auto"/>
-        <w:jc w:val="both"/>
-      </w:pPr>
-      <w:r>
-        <w:rPr>
-          <w:b/>
-        </w:rPr>
-        <w:t>Table 4. Спрацювання та паводкова хвиля за даними спостережень з орбіти.</w:t>
-      </w:r>
-    </w:p>
-    <w:tbl>
-      <w:tblPr>
-        <w:tblStyle w:val="TableGrid"/>
-        <w:tblW w:type="auto" w:w="0"/>
-        <w:jc w:val="center"/>
-        <w:tblLook w:firstColumn="1" w:firstRow="1" w:lastColumn="0" w:lastRow="0" w:noHBand="0" w:noVBand="1" w:val="04A0"/>
-      </w:tblPr>
-      <w:tblGrid>
-        <w:gridCol w:w="1728"/>
-        <w:gridCol w:w="1728"/>
-        <w:gridCol w:w="1728"/>
-        <w:gridCol w:w="1728"/>
-        <w:gridCol w:w="1728"/>
-      </w:tblGrid>
-      <w:tr>
-        <w:tc>
-          <w:tcPr>
-            <w:tcW w:type="dxa" w:w="1728"/>
-          </w:tcPr>
-          <w:p>
-            <w:r>
-              <w:rPr>
-                <w:b/>
-              </w:rPr>
-              <w:t>claim_id</w:t>
-            </w:r>
-          </w:p>
-        </w:tc>
-        <w:tc>
-          <w:tcPr>
-            <w:tcW w:type="dxa" w:w="1728"/>
-          </w:tcPr>
-          <w:p>
-            <w:r>
-              <w:rPr>
-                <w:b/>
-              </w:rPr>
-              <w:t>claim_text</w:t>
-            </w:r>
-          </w:p>
-        </w:tc>
-        <w:tc>
-          <w:tcPr>
-            <w:tcW w:type="dxa" w:w="1728"/>
-          </w:tcPr>
-          <w:p>
-            <w:r>
-              <w:rPr>
-                <w:b/>
-              </w:rPr>
-              <w:t>value_resolved</w:t>
-            </w:r>
-          </w:p>
-        </w:tc>
-        <w:tc>
-          <w:tcPr>
-            <w:tcW w:type="dxa" w:w="1728"/>
-          </w:tcPr>
-          <w:p>
-            <w:r>
-              <w:rPr>
-                <w:b/>
-              </w:rPr>
-              <w:t>n_resolved</w:t>
-            </w:r>
-          </w:p>
-        </w:tc>
-        <w:tc>
-          <w:tcPr>
-            <w:tcW w:type="dxa" w:w="1728"/>
-          </w:tcPr>
-          <w:p>
-            <w:r>
-              <w:rPr>
-                <w:b/>
-              </w:rPr>
-              <w:t>audit_status</w:t>
-            </w:r>
-          </w:p>
-        </w:tc>
-      </w:tr>
-      <w:tr>
-        <w:tc>
-          <w:tcPr>
-            <w:tcW w:type="dxa" w:w="1728"/>
-          </w:tcPr>
-          <w:p>
-            <w:r>
-              <w:t>D1.1</w:t>
-            </w:r>
-          </w:p>
-        </w:tc>
-        <w:tc>
-          <w:tcPr>
-            <w:tcW w:type="dxa" w:w="1728"/>
-          </w:tcPr>
-          <w:p>
-            <w:r>
-              <w:t>SWOT observed the reservoir outlet through the drawdown itself: during the fast-sampling calibration orbit the outlet water surface fell from the impounded level to the residual river within a fortnight.</w:t>
-            </w:r>
-          </w:p>
-        </w:tc>
-        <w:tc>
-          <w:tcPr>
-            <w:tcW w:type="dxa" w:w="1728"/>
-          </w:tcPr>
-          <w:p>
-            <w:r>
-              <w:t>outlet 5.63 m EVRF2019 on 13 June, from 17.53 m on 31 May</w:t>
-            </w:r>
-          </w:p>
-        </w:tc>
-        <w:tc>
-          <w:tcPr>
-            <w:tcW w:type="dxa" w:w="1728"/>
-          </w:tcPr>
-          <w:p>
-            <w:r>
-              <w:t>3 SWOT nodes on the date</w:t>
-            </w:r>
-          </w:p>
-        </w:tc>
-        <w:tc>
-          <w:tcPr>
-            <w:tcW w:type="dxa" w:w="1728"/>
-          </w:tcPr>
-          <w:p>
-            <w:r>
-              <w:t>SUPPORTED_WITH_LIMITATION</w:t>
-            </w:r>
-          </w:p>
-        </w:tc>
-      </w:tr>
-      <w:tr>
-        <w:tc>
-          <w:tcPr>
-            <w:tcW w:type="dxa" w:w="1728"/>
-          </w:tcPr>
-          <w:p>
-            <w:r>
-              <w:t>D2.1</w:t>
-            </w:r>
-          </w:p>
-        </w:tc>
-        <w:tc>
-          <w:tcPr>
-            <w:tcW w:type="dxa" w:w="1728"/>
-          </w:tcPr>
-          <w:p>
-            <w:r>
-              <w:t>Below the dam the same orbit recorded the flood wave as a longitudinal rise profile that decays downstream and arrives later with distance.</w:t>
-            </w:r>
-          </w:p>
-        </w:tc>
-        <w:tc>
-          <w:tcPr>
-            <w:tcW w:type="dxa" w:w="1728"/>
-          </w:tcPr>
-          <w:p>
-            <w:r>
-              <w:t>rise 9.10 m at 15 km (peak 10.24 m on 2023-06-07)</w:t>
-            </w:r>
-          </w:p>
-        </w:tc>
-        <w:tc>
-          <w:tcPr>
-            <w:tcW w:type="dxa" w:w="1728"/>
-          </w:tcPr>
-          <w:p>
-            <w:r>
-              <w:t>48 nodes in the bin</w:t>
-            </w:r>
-          </w:p>
-        </w:tc>
-        <w:tc>
-          <w:tcPr>
-            <w:tcW w:type="dxa" w:w="1728"/>
-          </w:tcPr>
-          <w:p>
-            <w:r>
-              <w:t>SUPPORTED_WITH_LIMITATION</w:t>
-            </w:r>
-          </w:p>
-        </w:tc>
-      </w:tr>
-      <w:tr>
-        <w:tc>
-          <w:tcPr>
-            <w:tcW w:type="dxa" w:w="1728"/>
-          </w:tcPr>
-          <w:p>
-            <w:r>
-              <w:t>M1.2</w:t>
-            </w:r>
-          </w:p>
-        </w:tc>
-        <w:tc>
-          <w:tcPr>
-            <w:tcW w:type="dxa" w:w="1728"/>
-          </w:tcPr>
-          <w:p>
-            <w:r>
-              <w:t>The drawdown period is intermediate between the two regimes.</w:t>
-            </w:r>
-          </w:p>
-        </w:tc>
-        <w:tc>
-          <w:tcPr>
-            <w:tcW w:type="dxa" w:w="1728"/>
+            <w:tcW w:type="dxa" w:w="2160"/>
           </w:tcPr>
           <w:p>
             <w:r>
@@ -3177,7 +1665,17 @@
         </w:tc>
         <w:tc>
           <w:tcPr>
-            <w:tcW w:type="dxa" w:w="1728"/>
+            <w:tcW w:type="dxa" w:w="2160"/>
+          </w:tcPr>
+          <w:p>
+            <w:r>
+              <w:t>sits between the pre-breach and post-breach medians</w:t>
+            </w:r>
+          </w:p>
+        </w:tc>
+        <w:tc>
+          <w:tcPr>
+            <w:tcW w:type="dxa" w:w="2160"/>
           </w:tcPr>
           <w:p>
             <w:r>
@@ -3185,238 +1683,21 @@
             </w:r>
           </w:p>
         </w:tc>
+      </w:tr>
+      <w:tr>
         <w:tc>
           <w:tcPr>
-            <w:tcW w:type="dxa" w:w="1728"/>
+            <w:tcW w:type="dxa" w:w="2160"/>
           </w:tcPr>
           <w:p>
             <w:r>
-              <w:t>SUPPORTED_WITH_LIMITATION</w:t>
-            </w:r>
-          </w:p>
-        </w:tc>
-      </w:tr>
-    </w:tbl>
-    <w:p/>
-    <w:p>
-      <w:pPr>
-        <w:spacing w:line="360" w:lineRule="auto"/>
-        <w:jc w:val="both"/>
-      </w:pPr>
-      <w:r>
-        <w:t>На рисунку 15  показано ряд значень на виході відносно гідрологічного поста вище за течією та профіль підйому рівня води нижче за течією.</w:t>
-      </w:r>
-    </w:p>
-    <w:p>
-      <w:pPr>
-        <w:pStyle w:val="Heading1"/>
-      </w:pPr>
-      <w:r>
-        <w:t>6.3 Post-breach longitudinal gradient</w:t>
-      </w:r>
-    </w:p>
-    <w:p>
-      <w:pPr>
-        <w:spacing w:line="360" w:lineRule="auto"/>
-        <w:jc w:val="both"/>
-      </w:pPr>
-      <w:r>
-        <w:t>Для 14 прольотів до прориву греблі та 14 прольотів після прориву греблі з пікетажем щонайменше 20 km, медіанний ухил за оцінювачем Тейла–Сена для кожного прольоту змінився з +0.090 cm/km до -&gt; +3.314 cm/km; різниця +3.223 cm/km; різниця має 95 % бутстреп-довірчий інтервал 95% CI [+1.994, +5.071] см/км; перестановочний тест p = 1.00e-04; тест Манна–Вітні p = 3.92e-05; додатні ухили до 10/14  (знаковий тест p = 0.180) проти після 14/14  (p = 1.22e-04). Кожен із 14 прольотів після прориву греблі є додатним. Результат є стійким до вибору оцінювача: метод найменших квадратів дає OLS +0.038 -&gt; +2.781 cm/km, різниця +2.744 cm/km (95% CI [+1.454, +4.323]; перестановочний тест p = 3.00e-04). Кожен ухил для прольоту — це апроксимація через шість точок медіан променів одного прольоту над приблизно 20–70 km осьової лінії водосховища; твердження стосується розподілу цих локальних ухилів за датами, а не єдиного градієнта всього водосховища.</w:t>
-      </w:r>
-    </w:p>
-    <w:p>
-      <w:pPr>
-        <w:spacing w:line="360" w:lineRule="auto"/>
-        <w:jc w:val="both"/>
-      </w:pPr>
-      <w:r>
-        <w:rPr>
-          <w:b/>
-        </w:rPr>
-        <w:t>Table 3. Порівняння гідравлічного стану до та після прориву греблі.</w:t>
-      </w:r>
-    </w:p>
-    <w:tbl>
-      <w:tblPr>
-        <w:tblStyle w:val="TableGrid"/>
-        <w:tblW w:type="auto" w:w="0"/>
-        <w:jc w:val="center"/>
-        <w:tblLook w:firstColumn="1" w:firstRow="1" w:lastColumn="0" w:lastRow="0" w:noHBand="0" w:noVBand="1" w:val="04A0"/>
-      </w:tblPr>
-      <w:tblGrid>
-        <w:gridCol w:w="1440"/>
-        <w:gridCol w:w="1440"/>
-        <w:gridCol w:w="1440"/>
-        <w:gridCol w:w="1440"/>
-        <w:gridCol w:w="1440"/>
-        <w:gridCol w:w="1440"/>
-      </w:tblGrid>
-      <w:tr>
-        <w:tc>
-          <w:tcPr>
-            <w:tcW w:type="dxa" w:w="1440"/>
-          </w:tcPr>
-          <w:p>
-            <w:r>
-              <w:rPr>
-                <w:b/>
-              </w:rPr>
-              <w:t>claim_id</w:t>
+              <w:t>Slope, estimator sensitivity (ordinary least squares)</w:t>
             </w:r>
           </w:p>
         </w:tc>
         <w:tc>
           <w:tcPr>
-            <w:tcW w:type="dxa" w:w="1440"/>
-          </w:tcPr>
-          <w:p>
-            <w:r>
-              <w:rPr>
-                <w:b/>
-              </w:rPr>
-              <w:t>claim_text</w:t>
-            </w:r>
-          </w:p>
-        </w:tc>
-        <w:tc>
-          <w:tcPr>
-            <w:tcW w:type="dxa" w:w="1440"/>
-          </w:tcPr>
-          <w:p>
-            <w:r>
-              <w:rPr>
-                <w:b/>
-              </w:rPr>
-              <w:t>value_resolved</w:t>
-            </w:r>
-          </w:p>
-        </w:tc>
-        <w:tc>
-          <w:tcPr>
-            <w:tcW w:type="dxa" w:w="1440"/>
-          </w:tcPr>
-          <w:p>
-            <w:r>
-              <w:rPr>
-                <w:b/>
-              </w:rPr>
-              <w:t>uncertainty_resolved</w:t>
-            </w:r>
-          </w:p>
-        </w:tc>
-        <w:tc>
-          <w:tcPr>
-            <w:tcW w:type="dxa" w:w="1440"/>
-          </w:tcPr>
-          <w:p>
-            <w:r>
-              <w:rPr>
-                <w:b/>
-              </w:rPr>
-              <w:t>n_resolved</w:t>
-            </w:r>
-          </w:p>
-        </w:tc>
-        <w:tc>
-          <w:tcPr>
-            <w:tcW w:type="dxa" w:w="1440"/>
-          </w:tcPr>
-          <w:p>
-            <w:r>
-              <w:rPr>
-                <w:b/>
-              </w:rPr>
-              <w:t>audit_status</w:t>
-            </w:r>
-          </w:p>
-        </w:tc>
-      </w:tr>
-      <w:tr>
-        <w:tc>
-          <w:tcPr>
-            <w:tcW w:type="dxa" w:w="1440"/>
-          </w:tcPr>
-          <w:p>
-            <w:r>
-              <w:t>M1.1</w:t>
-            </w:r>
-          </w:p>
-        </w:tc>
-        <w:tc>
-          <w:tcPr>
-            <w:tcW w:type="dxa" w:w="1440"/>
-          </w:tcPr>
-          <w:p>
-            <w:r>
-              <w:t>The pre-breach impounded reservoir had a near-level main water surface, whereas after the dam breach the system developed a persistent, directional, river-like longitudinal hydraulic gradient.</w:t>
-            </w:r>
-          </w:p>
-        </w:tc>
-        <w:tc>
-          <w:tcPr>
-            <w:tcW w:type="dxa" w:w="1440"/>
-          </w:tcPr>
-          <w:p>
-            <w:r>
-              <w:t>Theil-Sen median +0.090 cm/km pre -&gt; +3.314 cm/km post; difference +3.223 cm/km</w:t>
-            </w:r>
-          </w:p>
-        </w:tc>
-        <w:tc>
-          <w:tcPr>
-            <w:tcW w:type="dxa" w:w="1440"/>
-          </w:tcPr>
-          <w:p>
-            <w:r>
-              <w:t>95% CI [+1.994, +5.071] cm/km; permutation p = 1.00e-04; Mann-Whitney p = 3.92e-05; positive slopes pre 10/14 (sign test p = 0.180) vs post 14/14 (p = 1.22e-04)</w:t>
-            </w:r>
-          </w:p>
-        </w:tc>
-        <w:tc>
-          <w:tcPr>
-            <w:tcW w:type="dxa" w:w="1440"/>
-          </w:tcPr>
-          <w:p>
-            <w:r>
-              <w:t>14 pre / 14 post</w:t>
-            </w:r>
-          </w:p>
-        </w:tc>
-        <w:tc>
-          <w:tcPr>
-            <w:tcW w:type="dxa" w:w="1440"/>
-          </w:tcPr>
-          <w:p>
-            <w:r>
-              <w:t>SUPPORTED</w:t>
-            </w:r>
-          </w:p>
-        </w:tc>
-      </w:tr>
-      <w:tr>
-        <w:tc>
-          <w:tcPr>
-            <w:tcW w:type="dxa" w:w="1440"/>
-          </w:tcPr>
-          <w:p>
-            <w:r>
-              <w:t>M1.3</w:t>
-            </w:r>
-          </w:p>
-        </w:tc>
-        <w:tc>
-          <w:tcPr>
-            <w:tcW w:type="dxa" w:w="1440"/>
-          </w:tcPr>
-          <w:p>
-            <w:r>
-              <w:t>The result is estimator-robust: OLS gives the same sign, a similar magnitude and the same conclusion.</w:t>
-            </w:r>
-          </w:p>
-        </w:tc>
-        <w:tc>
-          <w:tcPr>
-            <w:tcW w:type="dxa" w:w="1440"/>
+            <w:tcW w:type="dxa" w:w="2160"/>
           </w:tcPr>
           <w:p>
             <w:r>
@@ -3426,7 +1707,7 @@
         </w:tc>
         <w:tc>
           <w:tcPr>
-            <w:tcW w:type="dxa" w:w="1440"/>
+            <w:tcW w:type="dxa" w:w="2160"/>
           </w:tcPr>
           <w:p>
             <w:r>
@@ -3436,7 +1717,7 @@
         </w:tc>
         <w:tc>
           <w:tcPr>
-            <w:tcW w:type="dxa" w:w="1440"/>
+            <w:tcW w:type="dxa" w:w="2160"/>
           </w:tcPr>
           <w:p>
             <w:r>
@@ -3444,103 +1725,21 @@
             </w:r>
           </w:p>
         </w:tc>
-        <w:tc>
-          <w:tcPr>
-            <w:tcW w:type="dxa" w:w="1440"/>
-          </w:tcPr>
-          <w:p>
-            <w:r>
-              <w:t>SUPPORTED</w:t>
-            </w:r>
-          </w:p>
-        </w:tc>
       </w:tr>
       <w:tr>
         <w:tc>
           <w:tcPr>
-            <w:tcW w:type="dxa" w:w="1440"/>
+            <w:tcW w:type="dxa" w:w="2160"/>
           </w:tcPr>
           <w:p>
             <w:r>
-              <w:t>M1.2</w:t>
+              <w:t>Slope, channel-restricted control</w:t>
             </w:r>
           </w:p>
         </w:tc>
         <w:tc>
           <w:tcPr>
-            <w:tcW w:type="dxa" w:w="1440"/>
-          </w:tcPr>
-          <w:p>
-            <w:r>
-              <w:t>The drawdown period is intermediate between the two regimes.</w:t>
-            </w:r>
-          </w:p>
-        </w:tc>
-        <w:tc>
-          <w:tcPr>
-            <w:tcW w:type="dxa" w:w="1440"/>
-          </w:tcPr>
-          <w:p>
-            <w:r>
-              <w:t>Theil-Sen median +3.245 cm/km (2023-07-07..2023-09-07)</w:t>
-            </w:r>
-          </w:p>
-        </w:tc>
-        <w:tc>
-          <w:tcPr>
-            <w:tcW w:type="dxa" w:w="1440"/>
-          </w:tcPr>
-          <w:p>
-            <w:r>
-              <w:t>sits between the pre-breach and post-breach medians</w:t>
-            </w:r>
-          </w:p>
-        </w:tc>
-        <w:tc>
-          <w:tcPr>
-            <w:tcW w:type="dxa" w:w="1440"/>
-          </w:tcPr>
-          <w:p>
-            <w:r>
-              <w:t>5</w:t>
-            </w:r>
-          </w:p>
-        </w:tc>
-        <w:tc>
-          <w:tcPr>
-            <w:tcW w:type="dxa" w:w="1440"/>
-          </w:tcPr>
-          <w:p>
-            <w:r>
-              <w:t>SUPPORTED_WITH_LIMITATION</w:t>
-            </w:r>
-          </w:p>
-        </w:tc>
-      </w:tr>
-      <w:tr>
-        <w:tc>
-          <w:tcPr>
-            <w:tcW w:type="dxa" w:w="1440"/>
-          </w:tcPr>
-          <w:p>
-            <w:r>
-              <w:t>M1.4</w:t>
-            </w:r>
-          </w:p>
-        </w:tc>
-        <w:tc>
-          <w:tcPr>
-            <w:tcW w:type="dxa" w:w="1440"/>
-          </w:tcPr>
-          <w:p>
-            <w:r>
-              <w:t>Restricting both periods to the main channel weakens the contrast and its confidence interval includes zero: the channel-only test is underpowered, not a refutation.</w:t>
-            </w:r>
-          </w:p>
-        </w:tc>
-        <w:tc>
-          <w:tcPr>
-            <w:tcW w:type="dxa" w:w="1440"/>
+            <w:tcW w:type="dxa" w:w="2160"/>
           </w:tcPr>
           <w:p>
             <w:r>
@@ -3550,7 +1749,7 @@
         </w:tc>
         <w:tc>
           <w:tcPr>
-            <w:tcW w:type="dxa" w:w="1440"/>
+            <w:tcW w:type="dxa" w:w="2160"/>
           </w:tcPr>
           <w:p>
             <w:r>
@@ -3560,7 +1759,7 @@
         </w:tc>
         <w:tc>
           <w:tcPr>
-            <w:tcW w:type="dxa" w:w="1440"/>
+            <w:tcW w:type="dxa" w:w="2160"/>
           </w:tcPr>
           <w:p>
             <w:r>
@@ -3568,13 +1767,45 @@
             </w:r>
           </w:p>
         </w:tc>
+      </w:tr>
+      <w:tr>
         <w:tc>
           <w:tcPr>
-            <w:tcW w:type="dxa" w:w="1440"/>
+            <w:tcW w:type="dxa" w:w="2160"/>
           </w:tcPr>
           <w:p>
             <w:r>
-              <w:t>REVISE_UNCERTAINTY</w:t>
+              <w:t>Per-overpass measurement uncertainty, post-breach</w:t>
+            </w:r>
+          </w:p>
+        </w:tc>
+        <w:tc>
+          <w:tcPr>
+            <w:tcW w:type="dxa" w:w="2160"/>
+          </w:tcPr>
+          <w:p>
+            <w:r>
+              <w:t>—</w:t>
+            </w:r>
+          </w:p>
+        </w:tc>
+        <w:tc>
+          <w:tcPr>
+            <w:tcW w:type="dxa" w:w="2160"/>
+          </w:tcPr>
+          <w:p>
+            <w:r>
+              <w:t>—</w:t>
+            </w:r>
+          </w:p>
+        </w:tc>
+        <w:tc>
+          <w:tcPr>
+            <w:tcW w:type="dxa" w:w="2160"/>
+          </w:tcPr>
+          <w:p>
+            <w:r>
+              <w:t>—</w:t>
             </w:r>
           </w:p>
         </w:tc>
@@ -3582,27 +1813,101 @@
       <w:tr>
         <w:tc>
           <w:tcPr>
-            <w:tcW w:type="dxa" w:w="1440"/>
+            <w:tcW w:type="dxa" w:w="2160"/>
           </w:tcPr>
           <w:p>
             <w:r>
-              <w:t>M2.1</w:t>
+              <w:t>Per-overpass measurement uncertainty, pre-breach</w:t>
             </w:r>
           </w:p>
         </w:tc>
         <w:tc>
           <w:tcPr>
-            <w:tcW w:type="dxa" w:w="1440"/>
+            <w:tcW w:type="dxa" w:w="2160"/>
           </w:tcPr>
           <w:p>
             <w:r>
-              <w:t>Water-surface heterogeneity within the former reservoir footprint increased after the breach.</w:t>
+              <w:t>—</w:t>
             </w:r>
           </w:p>
         </w:tc>
         <w:tc>
           <w:tcPr>
-            <w:tcW w:type="dxa" w:w="1440"/>
+            <w:tcW w:type="dxa" w:w="2160"/>
+          </w:tcPr>
+          <w:p>
+            <w:r>
+              <w:t>—</w:t>
+            </w:r>
+          </w:p>
+        </w:tc>
+        <w:tc>
+          <w:tcPr>
+            <w:tcW w:type="dxa" w:w="2160"/>
+          </w:tcPr>
+          <w:p>
+            <w:r>
+              <w:t>—</w:t>
+            </w:r>
+          </w:p>
+        </w:tc>
+      </w:tr>
+      <w:tr>
+        <w:tc>
+          <w:tcPr>
+            <w:tcW w:type="dxa" w:w="2160"/>
+          </w:tcPr>
+          <w:p>
+            <w:r>
+              <w:t>Minimum fitted span, 30 km</w:t>
+            </w:r>
+          </w:p>
+        </w:tc>
+        <w:tc>
+          <w:tcPr>
+            <w:tcW w:type="dxa" w:w="2160"/>
+          </w:tcPr>
+          <w:p>
+            <w:r>
+              <w:t>—</w:t>
+            </w:r>
+          </w:p>
+        </w:tc>
+        <w:tc>
+          <w:tcPr>
+            <w:tcW w:type="dxa" w:w="2160"/>
+          </w:tcPr>
+          <w:p>
+            <w:r>
+              <w:t>—</w:t>
+            </w:r>
+          </w:p>
+        </w:tc>
+        <w:tc>
+          <w:tcPr>
+            <w:tcW w:type="dxa" w:w="2160"/>
+          </w:tcPr>
+          <w:p>
+            <w:r>
+              <w:t>—</w:t>
+            </w:r>
+          </w:p>
+        </w:tc>
+      </w:tr>
+      <w:tr>
+        <w:tc>
+          <w:tcPr>
+            <w:tcW w:type="dxa" w:w="2160"/>
+          </w:tcPr>
+          <w:p>
+            <w:r>
+              <w:t>Within-overpass water-surface heterogeneity</w:t>
+            </w:r>
+          </w:p>
+        </w:tc>
+        <w:tc>
+          <w:tcPr>
+            <w:tcW w:type="dxa" w:w="2160"/>
           </w:tcPr>
           <w:p>
             <w:r>
@@ -3612,7 +1917,7 @@
         </w:tc>
         <w:tc>
           <w:tcPr>
-            <w:tcW w:type="dxa" w:w="1440"/>
+            <w:tcW w:type="dxa" w:w="2160"/>
           </w:tcPr>
           <w:p>
             <w:r>
@@ -3622,7 +1927,7 @@
         </w:tc>
         <w:tc>
           <w:tcPr>
-            <w:tcW w:type="dxa" w:w="1440"/>
+            <w:tcW w:type="dxa" w:w="2160"/>
           </w:tcPr>
           <w:p>
             <w:r>
@@ -3630,41 +1935,21 @@
             </w:r>
           </w:p>
         </w:tc>
-        <w:tc>
-          <w:tcPr>
-            <w:tcW w:type="dxa" w:w="1440"/>
-          </w:tcPr>
-          <w:p>
-            <w:r>
-              <w:t>SUPPORTED</w:t>
-            </w:r>
-          </w:p>
-        </w:tc>
       </w:tr>
       <w:tr>
         <w:tc>
           <w:tcPr>
-            <w:tcW w:type="dxa" w:w="1440"/>
+            <w:tcW w:type="dxa" w:w="2160"/>
           </w:tcPr>
           <w:p>
             <w:r>
-              <w:t>M3.1</w:t>
+              <w:t>Planform: water area</w:t>
             </w:r>
           </w:p>
         </w:tc>
         <w:tc>
           <w:tcPr>
-            <w:tcW w:type="dxa" w:w="1440"/>
-          </w:tcPr>
-          <w:p>
-            <w:r>
-              <w:t>Sentinel-2 shows the planform transition from a single continuous impounded surface to a fragmented, channel-dominated system with residual water bodies.</w:t>
-            </w:r>
-          </w:p>
-        </w:tc>
-        <w:tc>
-          <w:tcPr>
-            <w:tcW w:type="dxa" w:w="1440"/>
+            <w:tcW w:type="dxa" w:w="2160"/>
           </w:tcPr>
           <w:p>
             <w:r>
@@ -3674,7 +1959,7 @@
         </w:tc>
         <w:tc>
           <w:tcPr>
-            <w:tcW w:type="dxa" w:w="1440"/>
+            <w:tcW w:type="dxa" w:w="2160"/>
           </w:tcPr>
           <w:p>
             <w:r>
@@ -3684,7 +1969,7 @@
         </w:tc>
         <w:tc>
           <w:tcPr>
-            <w:tcW w:type="dxa" w:w="1440"/>
+            <w:tcW w:type="dxa" w:w="2160"/>
           </w:tcPr>
           <w:p>
             <w:r>
@@ -3692,41 +1977,21 @@
             </w:r>
           </w:p>
         </w:tc>
-        <w:tc>
-          <w:tcPr>
-            <w:tcW w:type="dxa" w:w="1440"/>
-          </w:tcPr>
-          <w:p>
-            <w:r>
-              <w:t>SUPPORTED_WITH_LIMITATION</w:t>
-            </w:r>
-          </w:p>
-        </w:tc>
       </w:tr>
       <w:tr>
         <w:tc>
           <w:tcPr>
-            <w:tcW w:type="dxa" w:w="1440"/>
+            <w:tcW w:type="dxa" w:w="2160"/>
           </w:tcPr>
           <w:p>
             <w:r>
-              <w:t>M3.2</w:t>
+              <w:t>Planform: residual water bodies</w:t>
             </w:r>
           </w:p>
         </w:tc>
         <w:tc>
           <w:tcPr>
-            <w:tcW w:type="dxa" w:w="1440"/>
-          </w:tcPr>
-          <w:p>
-            <w:r>
-              <w:t>Residual water bodies sit systematically below the adjacent channel stem, consistent with disconnected remnant ponds rather than a continuous water surface.</w:t>
-            </w:r>
-          </w:p>
-        </w:tc>
-        <w:tc>
-          <w:tcPr>
-            <w:tcW w:type="dxa" w:w="1440"/>
+            <w:tcW w:type="dxa" w:w="2160"/>
           </w:tcPr>
           <w:p>
             <w:r>
@@ -3736,7 +2001,7 @@
         </w:tc>
         <w:tc>
           <w:tcPr>
-            <w:tcW w:type="dxa" w:w="1440"/>
+            <w:tcW w:type="dxa" w:w="2160"/>
           </w:tcPr>
           <w:p>
             <w:r>
@@ -3746,7 +2011,7 @@
         </w:tc>
         <w:tc>
           <w:tcPr>
-            <w:tcW w:type="dxa" w:w="1440"/>
+            <w:tcW w:type="dxa" w:w="2160"/>
           </w:tcPr>
           <w:p>
             <w:r>
@@ -3754,78 +2019,6 @@
             </w:r>
           </w:p>
         </w:tc>
-        <w:tc>
-          <w:tcPr>
-            <w:tcW w:type="dxa" w:w="1440"/>
-          </w:tcPr>
-          <w:p>
-            <w:r>
-              <w:t>SUPPORTED_WITH_LIMITATION</w:t>
-            </w:r>
-          </w:p>
-        </w:tc>
-      </w:tr>
-      <w:tr>
-        <w:tc>
-          <w:tcPr>
-            <w:tcW w:type="dxa" w:w="1440"/>
-          </w:tcPr>
-          <w:p>
-            <w:r>
-              <w:t>V10.1</w:t>
-            </w:r>
-          </w:p>
-        </w:tc>
-        <w:tc>
-          <w:tcPr>
-            <w:tcW w:type="dxa" w:w="1440"/>
-          </w:tcPr>
-          <w:p>
-            <w:r>
-              <w:t>An independently reconstructed bathymetric surface reproduces the historical reservoir-wide drawdown exposure fraction and its upstream increase, under all four cross-validated interpolators.</w:t>
-            </w:r>
-          </w:p>
-        </w:tc>
-        <w:tc>
-          <w:tcPr>
-            <w:tcW w:type="dxa" w:w="1440"/>
-          </w:tcPr>
-          <w:p>
-            <w:r>
-              <w:t>whole mapped reservoir: historical 12.9% vs reconstructed 12.77% (diff -0.18 pp)</w:t>
-            </w:r>
-          </w:p>
-        </w:tc>
-        <w:tc>
-          <w:tcPr>
-            <w:tcW w:type="dxa" w:w="1440"/>
-          </w:tcPr>
-          <w:p>
-            <w:r>
-              <w:t>across interpolators 12.61-13.29% (spread 0.68 pp); by reach historical 3.9 / 9.4 / 26.0 % vs reconstructed 7.5 / 9.3 / 21.7 %</w:t>
-            </w:r>
-          </w:p>
-        </w:tc>
-        <w:tc>
-          <w:tcPr>
-            <w:tcW w:type="dxa" w:w="1440"/>
-          </w:tcPr>
-          <w:p>
-            <w:r>
-              <w:t>3</w:t>
-            </w:r>
-          </w:p>
-        </w:tc>
-        <w:tc>
-          <w:tcPr>
-            <w:tcW w:type="dxa" w:w="1440"/>
-          </w:tcPr>
-          <w:p>
-            <w:r>
-              <w:t>SUPPORTED</w:t>
-            </w:r>
-          </w:p>
-        </w:tc>
       </w:tr>
     </w:tbl>
     <w:p/>
@@ -3834,7 +2027,7 @@
         <w:pStyle w:val="Heading1"/>
       </w:pPr>
       <w:r>
-        <w:t>6.4 The channel-restricted control</w:t>
+        <w:t>6.3.1 What one overpass can and cannot show</w:t>
       </w:r>
     </w:p>
     <w:p>
@@ -3843,227 +2036,33 @@
         <w:jc w:val="both"/>
       </w:pPr>
       <w:r>
-        <w:t>Обмеження обох періодів класифікованим головним руслом послаблює контраст, а його інтервал включає нуль: оцінювач Тейла–Сена різниці +1.109 cm/km, 95% CI [-0.086, +2.186] на 20 pre / 6 post. Це зазначено як обмеження основного результату, який тому слід трактувати як твердження про водну поверхню в межах колишньої площі водосховища, а не суворо про русло.</w:t>
+        <w:t xml:space="preserve">Наведений вище інтервал стосується різниці медіан </w:t>
+      </w:r>
+      <w:r>
+        <w:rPr>
+          <w:i/>
+        </w:rPr>
+        <w:t>між</w:t>
+      </w:r>
+      <w:r>
+        <w:t xml:space="preserve"> прольотами. Це не твердження про будь-який окремий проліт, і ці два показники не слід сприймати як один. Побудований за шістьма точками медіан променів на ділянці близько 25 km, індивідуальний ухил водної поверхні після прориву греблі визначається недостатньо точно: (; n = ). До прориву греблі та сама апроксимація є значно точнішою — — оскільки горизонтальна поверхня не дає підстав для розбіжностей між променями, тоді як похила, просторово неоднорідна поверхня — дає.</w:t>
       </w:r>
     </w:p>
     <w:p>
       <w:pPr>
-        <w:pStyle w:val="Heading1"/>
-      </w:pPr>
-      <w:r>
-        <w:t>6.5 Water-surface heterogeneity</w:t>
+        <w:spacing w:line="360" w:lineRule="auto"/>
+        <w:jc w:val="both"/>
+      </w:pPr>
+      <w:r>
+        <w:t>Отже, перехід підтверджується повторюваністю, а не точністю: кожен прохід після прориву греблі є позитивним, тоді як раніше такими були лише десять із чотирнадцяти, і саме ця узгодженість, а не чіткість будь-якого окремого вимірювання, узагальнюється довірчим інтервалом у Розділі 6.3  (Таким чином, доказом переходу є сукупність — кожен прохід після прориву греблі є позитивним, а також різниця медіан, а не точність будь-якого окремого вимірювання. Точність на один прохід тут нижча, ніж опубліковані еталони ухилу ICESat-2  у масштабі ділянки, оскільки апроксимації використовують медіани шести променів на короткому відрізку, а не щільний набір даних для ділянки).</w:t>
       </w:r>
     </w:p>
     <w:p>
       <w:pPr>
-        <w:spacing w:line="360" w:lineRule="auto"/>
-        <w:jc w:val="both"/>
-      </w:pPr>
-      <w:r>
-        <w:t>На всіх ATL13 dates у межах променя, діапазон висоти водної поверхні p95–p05  у межах прольоту зріс з 0.117 m до 0.397 m, різниця +0.280 m (95% CI [+0.138, +0.367] м; перестановочний тест p = 5.00e-05; Mann-Whitney p = 1.57e-11; 192 до / 23 після). Ця метрика обчислюється для повної вибірки ATL13  і відрізняється від діапазону вибірки ухилу водної поверхні в межах профілю.</w:t>
-      </w:r>
-    </w:p>
-    <w:p>
-      <w:pPr>
         <w:pStyle w:val="Heading1"/>
       </w:pPr>
       <w:r>
-        <w:t>6.6 Planform transformation</w:t>
-      </w:r>
-    </w:p>
-    <w:p>
-      <w:pPr>
-        <w:spacing w:line="360" w:lineRule="auto"/>
-        <w:jc w:val="both"/>
-      </w:pPr>
-      <w:r>
-        <w:t>Маски води Sentinel-2  із порогом покриття демонструють перехід від однієї суцільної підпертої поверхні до русла з розрізненими залишками: до прориву греблі 2023-06-05: 2  водних об'єктів, 2,129 km2, найбільший компонент 99.995% водної площі | після прориву греблі медіана 503  об'єктів, 289 km2, найбільший компонент 58.2%. Лише одна дата до прориву греблі має майже повне покриття, тому цей контраст є описовим і не містить результатів перевірки значущості; кількість водних об'єктів не наводиться, оскільки вона масштабується відповідно до спостережуваної частки площі охоплення.</w:t>
-      </w:r>
-    </w:p>
-    <w:p>
-      <w:pPr>
-        <w:pStyle w:val="Heading1"/>
-      </w:pPr>
-      <w:r>
-        <w:t>6.7 Residual water bodies</w:t>
-      </w:r>
-    </w:p>
-    <w:p>
-      <w:pPr>
-        <w:spacing w:line="360" w:lineRule="auto"/>
-        <w:jc w:val="both"/>
-      </w:pPr>
-      <w:r>
-        <w:t>Класифіковані залишкові водні об'єкти розташовані нижче прилеглого русла: медіанне зміщення -0.595 m (NMAD 0.459 m; p05 -1.19, p95 +0.51 m; 15.3% розташовані вище русла; n = 678), що узгоджується з відокремленими залишками, які залягають у зниженнях, а не з безперервною поверхнею.</w:t>
-      </w:r>
-    </w:p>
-    <w:p>
-      <w:pPr>
-        <w:pStyle w:val="Heading1"/>
-      </w:pPr>
-      <w:r>
-        <w:t>6.8 Persistence</w:t>
-      </w:r>
-    </w:p>
-    <w:p>
-      <w:pPr>
-        <w:spacing w:line="360" w:lineRule="auto"/>
-        <w:jc w:val="both"/>
-      </w:pPr>
-      <w:r>
-        <w:t>Кожен проліт після прориву греблі з січня 2024  до листопада 2025  має додатний ухил водної поверхні; узгодженість знаків 14/14  та величина ефекту, а не p-значення, є доказом того, що новий стан зберігається після завершення перехідного процесу дренажу.</w:t>
-      </w:r>
-    </w:p>
-    <w:p>
-      <w:pPr>
-        <w:pStyle w:val="Heading1"/>
-      </w:pPr>
-      <w:r>
-        <w:t>6.9 Downstream geometry</w:t>
-      </w:r>
-    </w:p>
-    <w:p>
-      <w:pPr>
-        <w:spacing w:line="360" w:lineRule="auto"/>
-        <w:jc w:val="both"/>
-      </w:pPr>
-      <w:r>
-        <w:t>Русло між греблею та Херсоном також змінило свою геометрію — його ширина змоченого перерізу на порівнювані дати є більшою після прориву греблі, — проте цей результат, його метод та відповідний рисунок належать до супровідної статті, де він слугує ціллю валідації для двовимірної моделі.</w:t>
-      </w:r>
-    </w:p>
-    <w:p>
-      <w:pPr>
-        <w:pStyle w:val="Title"/>
-      </w:pPr>
-      <w:r>
-        <w:t>7. DISCUSSION</w:t>
-      </w:r>
-    </w:p>
-    <w:p>
-      <w:pPr>
-        <w:spacing w:line="360" w:lineRule="auto"/>
-        <w:jc w:val="both"/>
-      </w:pPr>
-      <w:r>
-        <w:t>Ділянки, звільнені від підпору, зазнають змін, які не є ні рівномірними, ні миттєвими (Nichols et al., 2017), а ерозійні русла, що утворилися після прориву греблі, розширюються та звужуються через мігруючі фронти, а не стабілізуються монотонно (Cantelli et al., 2004); (Cantelli et al., 2007).</w:t>
-      </w:r>
-    </w:p>
-    <w:p>
-      <w:pPr>
-        <w:pStyle w:val="Heading1"/>
-      </w:pPr>
-      <w:r>
-        <w:t>7.1 From a reservoir-like to a river-dominated regime</w:t>
-      </w:r>
-    </w:p>
-    <w:p>
-      <w:pPr>
-        <w:spacing w:line="360" w:lineRule="auto"/>
-        <w:jc w:val="both"/>
-      </w:pPr>
-      <w:r>
-        <w:t>До прориву греблі знак ухилу водної поверхні на кожний проліт був невідрізнюваним від підкидання монети, а поверхня змінювалася на сантиметри на десятки кілометрів; після нього кожен проліт показує підйом води вище за течією на кілька сантиметрів на кілометр із мінливістю в масштабі метрів, і ця зміна була присутня вже під час спрацювання. Порівняння з переходами від водосховища до річки, задокументованими в інших джерелах, належить до Розділу 7.8  і притримується до моменту підтвердження результатів пошуку літератури.</w:t>
-      </w:r>
-    </w:p>
-    <w:p>
-      <w:pPr>
-        <w:pStyle w:val="Heading1"/>
-      </w:pPr>
-      <w:r>
-        <w:t>7.2 Why area alone misses the transition</w:t>
-      </w:r>
-    </w:p>
-    <w:p>
-      <w:pPr>
-        <w:spacing w:line="360" w:lineRule="auto"/>
-        <w:jc w:val="both"/>
-      </w:pPr>
-      <w:r>
-        <w:t>Запис планової конфігурації показує одну суцільну поверхню, що перетворюється на русло із залишками, проте лише одна дата до моменту прорив греблі має повне покриття, а кількість об'єктів масштабується відповідно до спостережуваної частки. Альтиметричні величини — ухил водної поверхні та діапазон у межах проліт — є незалежними від покриття тайлів і несуть у собі висновок.</w:t>
-      </w:r>
-    </w:p>
-    <w:p>
-      <w:pPr>
-        <w:pStyle w:val="Heading1"/>
-      </w:pPr>
-      <w:r>
-        <w:t>7.3 What the satellites can and cannot resolve</w:t>
-      </w:r>
-    </w:p>
-    <w:p>
-      <w:pPr>
-        <w:spacing w:line="360" w:lineRule="auto"/>
-        <w:jc w:val="both"/>
-      </w:pPr>
-      <w:r>
-        <w:t>Кожен ухил водної поверхні для окремого прольоту є локальним і визначається через шість точок променя; узгодженість між даними SWOT та ICESat-2  є сантиметровою лише за умови тісної часової колокації; усереднений для озера продукт не може описати похиле тіло, що фрагментується. Зміна висоти рослинного покриву за даними ICESat-2  потребує пар повторних траєкторій, які поточна геометрія не забезпечує.</w:t>
-      </w:r>
-    </w:p>
-    <w:p>
-      <w:pPr>
-        <w:pStyle w:val="Heading1"/>
-      </w:pPr>
-      <w:r>
-        <w:t>7.4 The vertical frame</w:t>
-      </w:r>
-    </w:p>
-    <w:p>
-      <w:pPr>
-        <w:spacing w:line="360" w:lineRule="auto"/>
-        <w:jc w:val="both"/>
-      </w:pPr>
-      <w:r>
-        <w:t>Одна офіційна сітка, один квазігеоїд та явний припливний член є мінімумом; емпіричні поправки станцій є локальними і не переносяться між ділянками (Каховське водосховище -0.130 m [-0.184, -0.081] (n=5 станцій) проти Херсона +0.0051 m [-0.0515, +0.0608]). Походження растра квазігеоїда є відкритою проблемою цитування (Розділ 7.9).</w:t>
-      </w:r>
-    </w:p>
-    <w:p>
-      <w:pPr>
-        <w:pStyle w:val="Heading1"/>
-      </w:pPr>
-      <w:r>
-        <w:t>7.5 What the legacy hydrography contributes</w:t>
-      </w:r>
-    </w:p>
-    <w:p>
-      <w:pPr>
-        <w:spacing w:line="360" w:lineRule="auto"/>
-        <w:jc w:val="both"/>
-      </w:pPr>
-      <w:r>
-        <w:t>Проєктна документація фіксує поверхню до моменту прориву греблі двічі — робочі рівні та криву 1970 , а проміри глибин на карті, після встановлення їхнього рівня зведення, дають дно, чиє оголене дно внаслідок спрацювання узгоджується з історичною статистикою в межах діапазону відліку. Розкид 0.40 m між трьома шляхами до цього рівня, а не довірчий інтервал, є об'єктивною невизначеністю.</w:t>
-      </w:r>
-    </w:p>
-    <w:p>
-      <w:pPr>
-        <w:pStyle w:val="Heading1"/>
-      </w:pPr>
-      <w:r>
-        <w:t>7.6 What the geometry is for</w:t>
-      </w:r>
-    </w:p>
-    <w:p>
-      <w:pPr>
-        <w:spacing w:line="360" w:lineRule="auto"/>
-        <w:jc w:val="both"/>
-      </w:pPr>
-      <w:r>
-        <w:t>Реконструйоване тут дно — одна поверхня для водосховища, три для зон нижнього Дніпра, кожна з яких має оцінку крос-валідації лише за даними промірів глибин та визначену граничну умову — це рельєф, необхідний гідравлічній моделі сучасної системи, а ухили водної поверхні на кожний проліт є незалежною одиницею спостереження, яку така модель повинна відтворювати без попереднього калібрування за ними. Обидва набори даних передаються до супровідної статті як фіксовані вхідні параметри.</w:t>
-      </w:r>
-    </w:p>
-    <w:p>
-      <w:pPr>
-        <w:pStyle w:val="Heading1"/>
-      </w:pPr>
-      <w:r>
-        <w:t>7.7 Comparison with literature</w:t>
-      </w:r>
-    </w:p>
-    <w:p>
-      <w:pPr>
-        <w:pStyle w:val="Heading1"/>
-      </w:pPr>
-      <w:r>
-        <w:t>7.8 Comparison with literature</w:t>
+        <w:t>6.3.2 Sensitivity to the fitted span</w:t>
       </w:r>
     </w:p>
     <w:p>
@@ -4090,7 +2089,7 @@
         <w:jc w:val="both"/>
       </w:pPr>
       <w:r>
-        <w:t>&gt; `section: paragraph 143` · `status: blocked`</w:t>
+        <w:t>&gt; `section: paragraph 94` · `status: blocked`</w:t>
       </w:r>
     </w:p>
     <w:p>
@@ -4108,24 +2107,237 @@
         <w:jc w:val="both"/>
       </w:pPr>
       <w:r>
-        <w:t>Positioning statements below are constructed from the L-series literature evidence matrix; each is traceable to its theses, to paper-level relations and to DOIs with verified passages. No priority is asserted here: where a claim is not yet supportable, the marker says why.</w:t>
+        <w:t>(n = ). The 10 km and 20 km thresholds are not binding: the shortest fitted span in the sample is 20.3 km, so those rows repeat the headline rather than testing it. At 40 km only three passes per period remain and the difference falls to +2.988 cm/km.</w:t>
       </w:r>
     </w:p>
     <w:p>
       <w:pPr>
+        <w:pStyle w:val="Heading1"/>
+      </w:pPr>
+      <w:r>
+        <w:t>6.4 The channel-restricted control</w:t>
+      </w:r>
+    </w:p>
+    <w:p>
+      <w:pPr>
         <w:spacing w:line="360" w:lineRule="auto"/>
         <w:jc w:val="both"/>
       </w:pPr>
       <w:r>
-        <w:t>Розділ організовано у три паралельні шари, оскільки дослідження доводить три різні речі, і кожна з них спирається на окремий масив літератури. Відсутність у шарі Каховське водосховище — це те, що вносить це дослідження; відсутність у перехідному шарі або шарі даних є слабкістю його аргументації, а не результатом.</w:t>
+        <w:t>Обмеження обох періодів класифікованим головним руслом послаблює контраст, а його інтервал включає нуль: оцінювач Тейла–Сена різниці +1.109 cm/km, 95% CI [-0.086, +2.186] на 20 pre / 6 post. Це зазначено як обмеження основного результату, який тому слід трактувати як твердження про водну поверхню в межах колишньої площі водосховища, а не суворо про русло.</w:t>
       </w:r>
     </w:p>
     <w:p>
       <w:pPr>
-        <w:pStyle w:val="Heading2"/>
-      </w:pPr>
-      <w:r>
-        <w:t>K. What has already been observed at Kakhovka</w:t>
+        <w:pStyle w:val="Heading1"/>
+      </w:pPr>
+      <w:r>
+        <w:t>6.5 Water-surface heterogeneity</w:t>
+      </w:r>
+    </w:p>
+    <w:p>
+      <w:pPr>
+        <w:spacing w:line="360" w:lineRule="auto"/>
+        <w:jc w:val="both"/>
+      </w:pPr>
+      <w:r>
+        <w:t>На всіх ATL13 dates у межах променя, діапазон висоти водної поверхні p95–p05  у межах прольоту зріс з 0.117 m до 0.397 m, різниця +0.280 m (95% CI [+0.138, +0.367] м; перестановочний тест p = 5.00e-05; Mann-Whitney p = 1.57e-11; 192 до / 23 після). Ця метрика обчислюється для повної вибірки ATL13  і відрізняється від діапазону вибірки ухилу водної поверхні в межах профілю.</w:t>
+      </w:r>
+    </w:p>
+    <w:p>
+      <w:pPr>
+        <w:pStyle w:val="Heading1"/>
+      </w:pPr>
+      <w:r>
+        <w:t>6.6 Planform transformation</w:t>
+      </w:r>
+    </w:p>
+    <w:p>
+      <w:pPr>
+        <w:spacing w:line="360" w:lineRule="auto"/>
+        <w:jc w:val="both"/>
+      </w:pPr>
+      <w:r>
+        <w:t>Оптичні дані незалежно документують втрату єдиної пов’язаної підпертої поверхні (до прориву греблі 2023-06-05: 2 водних об’єктів, 2,129 km2, найбільший компонент 99.995% водної площі | після прориву греблі медіана 503 об’єктів, 289 km2, найбільший компонент 58.2%). Кількість компонентів не використовується для висновків: лише одна дата до прориву греблі має майже повне покриття, а спостережувана зв’язність масштабується відповідно до спостережуваної частки, тому цей контраст наводиться як підтвердження геометричного результату, а не як самостійне вимірювання.</w:t>
+      </w:r>
+    </w:p>
+    <w:p>
+      <w:pPr>
+        <w:pStyle w:val="Heading1"/>
+      </w:pPr>
+      <w:r>
+        <w:t>6.7 Residual water bodies</w:t>
+      </w:r>
+    </w:p>
+    <w:p>
+      <w:pPr>
+        <w:spacing w:line="360" w:lineRule="auto"/>
+        <w:jc w:val="both"/>
+      </w:pPr>
+      <w:r>
+        <w:t>Класифіковані залишкові водні об'єкти розташовані нижче прилеглого русла: медіанне зміщення -0.595 m (NMAD 0.459 m; p05 -1.19, p95 +0.51 m; 15.3% розташовані вище русла; n = 678), що узгоджується з відокремленими залишками, які залягають у зниженнях, а не з безперервною поверхнею.</w:t>
+      </w:r>
+    </w:p>
+    <w:p>
+      <w:pPr>
+        <w:pStyle w:val="Heading1"/>
+      </w:pPr>
+      <w:r>
+        <w:t>6.8 Persistence</w:t>
+      </w:r>
+    </w:p>
+    <w:p>
+      <w:pPr>
+        <w:spacing w:line="360" w:lineRule="auto"/>
+        <w:jc w:val="both"/>
+      </w:pPr>
+      <w:r>
+        <w:t>Кожен проліт після прориву греблі з січня 2024  до листопада 2025  має додатний ухил водної поверхні; узгодженість знаків 14/14  та величина ефекту, а не p-значення, є доказом того, що новий стан зберігається після завершення перехідного процесу дренажу.</w:t>
+      </w:r>
+    </w:p>
+    <w:p>
+      <w:pPr>
+        <w:pStyle w:val="Heading1"/>
+      </w:pPr>
+      <w:r>
+        <w:t>6.9 Downstream geometry</w:t>
+      </w:r>
+    </w:p>
+    <w:p>
+      <w:pPr>
+        <w:spacing w:line="360" w:lineRule="auto"/>
+        <w:jc w:val="both"/>
+      </w:pPr>
+      <w:r>
+        <w:t>Русло між греблею та Херсоном також змінило свою геометрію — його ширина змоченого перерізу на порівнювані дати є більшою після прориву греблі, — проте цей результат, його метод та відповідний рисунок належать до супровідної статті, де він слугує ціллю валідації для двовимірної моделі.</w:t>
+      </w:r>
+    </w:p>
+    <w:p>
+      <w:pPr>
+        <w:pStyle w:val="Title"/>
+      </w:pPr>
+      <w:r>
+        <w:t>7. INTERPRETATION</w:t>
+      </w:r>
+    </w:p>
+    <w:p>
+      <w:pPr>
+        <w:spacing w:line="360" w:lineRule="auto"/>
+        <w:jc w:val="both"/>
+      </w:pPr>
+      <w:r>
+        <w:t>Ділянки, звільнені від підпору, зазнають змін, які не є ні рівномірними, ні миттєвими (Nichols et al., 2017), а ерозійні русла, що утворилися після прориву греблі, розширюються та звужуються через мігруючі фронти, а не стабілізуються монотонно (Cantelli et al., 2004); (Cantelli et al., 2007).</w:t>
+      </w:r>
+    </w:p>
+    <w:p>
+      <w:pPr>
+        <w:pStyle w:val="Heading1"/>
+      </w:pPr>
+      <w:r>
+        <w:t>7.1 From an impounded to a river-dominated state</w:t>
+      </w:r>
+    </w:p>
+    <w:p>
+      <w:pPr>
+        <w:spacing w:line="360" w:lineRule="auto"/>
+        <w:jc w:val="both"/>
+      </w:pPr>
+      <w:r>
+        <w:t>До прориву греблі історичні дані зйомок та прольоти, здійснені до прориву греблі, узгоджуються в тому, що це конкретне водосховище мало майже горизонтальну поверхню на досліджуваній ділянці, з гідравлічним підйомом, меншим за вітровий нагін та сейші, що проходили через неї (середній гідравлічний підйом на 183 km: 0 cm (Qmin), 6 cm (Q20%), 42 cm (Q1%) | півамплітуда сейші в антиноді 17.5 cm | вітровий нагін на кінці 35 cm (15 m/s) до 148 cm (25 m/s)). Після спрацювання кожен проліт в аналізі демонструє позитивний градієнт у напрямку вниз за течією, і це спостерігається від перших прольотів після осушення аж до 2025  (медіана Тейла–Сена +3.245 cm/km (2023-07-07..2023-09-07)). Ми інтерпретуємо цю зміну як перехід від геометрії водної поверхні, що контролюється греблею, до такої, що контролюється руслом. Це діагноз, заснований на спостережуваній поверхні: він не є оцінкою витрати води, тертя чи енергетичного ухилу, і це твердження стосується саме цієї ділянки, а не водосховищ та річок загалом, які можуть відхилятися від цих ідеалізацій в умовах підпору, неусталеного руху та значного припливу води.</w:t>
+      </w:r>
+    </w:p>
+    <w:p>
+      <w:pPr>
+        <w:spacing w:line="360" w:lineRule="auto"/>
+        <w:jc w:val="both"/>
+      </w:pPr>
+      <w:r>
+        <w:t>Виміряна геометрична зміна узгоджується з процесами, описаними в літературі, де усунення гідравлічного контролю або примусове спрацювання висоти водної поверхні прискорює потік та ініціює врізання і подальше руслове пристосування. Лабораторні експерименти з прориву греблі документують швидке врізання, за яким слідує ерозійне звуження, а згодом — розширення ((Cantelli et al., 2004); (Cantelli et al., 2007)), а польові дослідження проривів дамб показують, що примусове спрацювання прискорює потік і сприяє врізанню в прилеглій системі ((Nichols et al., 2017)). Це процесуальні аналоги, а не масштабні еквіваленти: перший — це лоток, другий — дамба, а не гребля водосховища, і жоден із них не доводить, що стійкий градієнт, виміряний із супутника, є загальним діагностичним показником звільнення від підпору.</w:t>
+      </w:r>
+    </w:p>
+    <w:p>
+      <w:pPr>
+        <w:spacing w:line="360" w:lineRule="auto"/>
+        <w:jc w:val="both"/>
+      </w:pPr>
+      <w:r>
+        <w:t>До прориву греблі знак ухилу водної поверхні на кожний проліт був невідрізнюваним від підкидання монети, а поверхня змінювалася на сантиметри на десятки кілометрів; після нього кожен проліт показує підйом води вище за течією на кілька сантиметрів на кілометр із мінливістю в масштабі метрів, і ця зміна була присутня вже під час спрацювання. Порівняння з переходами від водосховища до річки, задокументованими в інших джерелах, належить до Розділу 7.8  і притримується до моменту підтвердження результатів пошуку літератури.</w:t>
+      </w:r>
+    </w:p>
+    <w:p>
+      <w:pPr>
+        <w:pStyle w:val="Heading1"/>
+      </w:pPr>
+      <w:r>
+        <w:t>7.2 Why area alone misses the transition</w:t>
+      </w:r>
+    </w:p>
+    <w:p>
+      <w:pPr>
+        <w:spacing w:line="360" w:lineRule="auto"/>
+        <w:jc w:val="both"/>
+      </w:pPr>
+      <w:r>
+        <w:t>Запис планової конфігурації показує одну суцільну поверхню, що перетворюється на русло із залишками, проте лише одна дата до моменту прорив греблі має повне покриття, а кількість об'єктів масштабується відповідно до спостережуваної частки. Альтиметричні величини — ухил водної поверхні та діапазон у межах проліт — є незалежними від покриття тайлів і несуть у собі висновок.</w:t>
+      </w:r>
+    </w:p>
+    <w:p>
+      <w:pPr>
+        <w:pStyle w:val="Heading1"/>
+      </w:pPr>
+      <w:r>
+        <w:t>7.3 What the satellites can and cannot resolve</w:t>
+      </w:r>
+    </w:p>
+    <w:p>
+      <w:pPr>
+        <w:spacing w:line="360" w:lineRule="auto"/>
+        <w:jc w:val="both"/>
+      </w:pPr>
+      <w:r>
+        <w:t>Кожен ухил водної поверхні для окремого прольоту є локальним і визначається через шість точок променя; узгодженість між даними SWOT та ICESat-2  є сантиметровою лише за умови тісної часової колокації; усереднений для озера продукт не може описати похиле тіло, що фрагментується. Зміна висоти рослинного покриву за даними ICESat-2  потребує пар повторних траєкторій, які поточна геометрія не забезпечує.</w:t>
+      </w:r>
+    </w:p>
+    <w:p>
+      <w:pPr>
+        <w:pStyle w:val="Heading1"/>
+      </w:pPr>
+      <w:r>
+        <w:t>7.4 The vertical frame</w:t>
+      </w:r>
+    </w:p>
+    <w:p>
+      <w:pPr>
+        <w:spacing w:line="360" w:lineRule="auto"/>
+        <w:jc w:val="both"/>
+      </w:pPr>
+      <w:r>
+        <w:t>Одна офіційна сітка, один квазігеоїд та явний припливний член є мінімумом; емпіричні поправки станцій є локальними і не переносяться між ділянками (Каховське водосховище -0.130 m [-0.184, -0.081] (n=5 станцій) проти Херсона +0.0051 m [-0.0515, +0.0608]). Походження растра квазігеоїда є відкритою проблемою цитування (Розділ 7.9).</w:t>
+      </w:r>
+    </w:p>
+    <w:p>
+      <w:pPr>
+        <w:pStyle w:val="Heading1"/>
+      </w:pPr>
+      <w:r>
+        <w:t>7.5 What the legacy hydrography contributes</w:t>
+      </w:r>
+    </w:p>
+    <w:p>
+      <w:pPr>
+        <w:spacing w:line="360" w:lineRule="auto"/>
+        <w:jc w:val="both"/>
+      </w:pPr>
+      <w:r>
+        <w:t>Проєктна документація фіксує поверхню до моменту прориву греблі двічі — робочі рівні та криву 1970 , а проміри глибин на карті, після встановлення їхнього рівня зведення, дають дно, чиє оголене дно внаслідок спрацювання узгоджується з історичною статистикою в межах діапазону відліку. Розкид 0.40 m між трьома шляхами до цього рівня, а не довірчий інтервал, є об'єктивною невизначеністю.</w:t>
+      </w:r>
+    </w:p>
+    <w:p>
+      <w:pPr>
+        <w:pStyle w:val="Heading1"/>
+      </w:pPr>
+      <w:r>
+        <w:t>7.6 What the geometry is for</w:t>
       </w:r>
     </w:p>
     <w:p>
@@ -4152,7 +2364,122 @@
         <w:jc w:val="both"/>
       </w:pPr>
       <w:r>
-        <w:t>&gt; `section: paragraph 146` · `status: blocked`</w:t>
+        <w:t>&gt; `section: paragraph 122` · `status: blocked`</w:t>
+      </w:r>
+    </w:p>
+    <w:p>
+      <w:pPr>
+        <w:spacing w:line="360" w:lineRule="auto"/>
+        <w:jc w:val="both"/>
+      </w:pPr>
+      <w:r>
+        <w:t>&gt; `blocks_submission: yes`</w:t>
+      </w:r>
+    </w:p>
+    <w:p>
+      <w:pPr>
+        <w:spacing w:line="360" w:lineRule="auto"/>
+        <w:jc w:val="both"/>
+      </w:pPr>
+      <w:r>
+        <w:t>The per-overpass slopes are the independent observation a hydraulic model of the current system must reproduce without having been calibrated on them, and they are handed to Paper 5 on that condition. The terrain such a model stands on is reconstructed in Paper 2.</w:t>
+      </w:r>
+    </w:p>
+    <w:p>
+      <w:pPr>
+        <w:pStyle w:val="Heading1"/>
+      </w:pPr>
+      <w:r>
+        <w:t>7.8 Comparison with literature</w:t>
+      </w:r>
+    </w:p>
+    <w:p>
+      <w:pPr>
+        <w:spacing w:line="360" w:lineRule="auto"/>
+        <w:jc w:val="both"/>
+      </w:pPr>
+      <w:r>
+        <w:t xml:space="preserve">&gt; </w:t>
+      </w:r>
+      <w:r>
+        <w:rPr>
+          <w:b/>
+        </w:rPr>
+        <w:t>[PENDING OPEN96]</w:t>
+      </w:r>
+      <w:r>
+        <w:t xml:space="preserve"> translation rejected: locked tokens did not round-trip; English kept</w:t>
+      </w:r>
+    </w:p>
+    <w:p>
+      <w:pPr>
+        <w:spacing w:line="360" w:lineRule="auto"/>
+        <w:jc w:val="both"/>
+      </w:pPr>
+      <w:r>
+        <w:t>&gt; `section: paragraph 124` · `status: blocked`</w:t>
+      </w:r>
+    </w:p>
+    <w:p>
+      <w:pPr>
+        <w:spacing w:line="360" w:lineRule="auto"/>
+        <w:jc w:val="both"/>
+      </w:pPr>
+      <w:r>
+        <w:t>&gt; `blocks_submission: yes`</w:t>
+      </w:r>
+    </w:p>
+    <w:p>
+      <w:pPr>
+        <w:spacing w:line="360" w:lineRule="auto"/>
+        <w:jc w:val="both"/>
+      </w:pPr>
+      <w:r>
+        <w:t>Positioning statements below are constructed from the L-series literature evidence matrix; each is traceable to its theses, to paper-level relations and to DOIs with verified passages. No priority is asserted here: where a claim is not yet supportable, the marker says why.</w:t>
+      </w:r>
+    </w:p>
+    <w:p>
+      <w:pPr>
+        <w:spacing w:line="360" w:lineRule="auto"/>
+        <w:jc w:val="both"/>
+      </w:pPr>
+      <w:r>
+        <w:t>Розділ організовано у три паралельні шари, оскільки дослідження доводить три різні речі, і кожна з них спирається на окремий масив літератури. Відсутність у шарі Каховське водосховище — це те, що вносить це дослідження; відсутність у перехідному шарі або шарі даних є слабкістю його аргументації, а не результатом.</w:t>
+      </w:r>
+    </w:p>
+    <w:p>
+      <w:pPr>
+        <w:pStyle w:val="Heading2"/>
+      </w:pPr>
+      <w:r>
+        <w:t>K. What has already been observed at Kakhovka</w:t>
+      </w:r>
+    </w:p>
+    <w:p>
+      <w:pPr>
+        <w:spacing w:line="360" w:lineRule="auto"/>
+        <w:jc w:val="both"/>
+      </w:pPr>
+      <w:r>
+        <w:t xml:space="preserve">&gt; </w:t>
+      </w:r>
+      <w:r>
+        <w:rPr>
+          <w:b/>
+        </w:rPr>
+        <w:t>[PENDING OPEN97]</w:t>
+      </w:r>
+      <w:r>
+        <w:t xml:space="preserve"> translation rejected: locked tokens did not round-trip; English kept</w:t>
+      </w:r>
+    </w:p>
+    <w:p>
+      <w:pPr>
+        <w:spacing w:line="360" w:lineRule="auto"/>
+        <w:jc w:val="both"/>
+      </w:pPr>
+      <w:r>
+        <w:t>&gt; `section: paragraph 127` · `status: blocked`</w:t>
       </w:r>
     </w:p>
     <w:p>
@@ -4716,7 +3043,7 @@
         <w:pStyle w:val="Heading1"/>
       </w:pPr>
       <w:r>
-        <w:t>7.8 Implications for monitoring and reconstruction</w:t>
+        <w:t>7.9 Implications for monitoring</w:t>
       </w:r>
     </w:p>
     <w:p>
@@ -4731,7 +3058,7 @@
         <w:rPr>
           <w:b/>
         </w:rPr>
-        <w:t>[PENDING OPEN96]</w:t>
+        <w:t>[PENDING OPEN98]</w:t>
       </w:r>
       <w:r>
         <w:t xml:space="preserve"> translation rejected: locked tokens did not round-trip; English kept</w:t>
@@ -4743,7 +3070,7 @@
         <w:jc w:val="both"/>
       </w:pPr>
       <w:r>
-        <w:t>&gt; `section: paragraph 170` · `status: blocked`</w:t>
+        <w:t>&gt; `section: paragraph 151` · `status: blocked`</w:t>
       </w:r>
     </w:p>
     <w:p>
@@ -4769,7 +3096,7 @@
         <w:pStyle w:val="Heading1"/>
       </w:pPr>
       <w:r>
-        <w:t>7.9 Limitations</w:t>
+        <w:t>7.10 Limitations</w:t>
       </w:r>
     </w:p>
     <w:p>
@@ -4778,156 +3105,66 @@
         <w:jc w:val="both"/>
       </w:pPr>
       <w:r>
-        <w:t xml:space="preserve">&gt; </w:t>
-      </w:r>
-      <w:r>
-        <w:rPr>
-          <w:b/>
-        </w:rPr>
-        <w:t>[PENDING OPEN53]</w:t>
-      </w:r>
-      <w:r>
-        <w:t xml:space="preserve"> paragraph withheld: B8.2 is CONTRADICTED</w:t>
+        <w:t>Контроль ухилу в обмеженому руслі є недостатньо потужним (різниця оцінювача Тейла–Сена +1.109 cm/km, 95% CI [-0.086, +2.186]). Зв'язок між ухилом та витратою води після прориву греблі є неперевірюваним: . Епоха зйомки промірів глибин не зафіксована (епоха відсутня), балтійська реалізація історичних таблиць не вказана, існують три суміщені прольоти SWOT–ICESat-2 , і жоден запис про вітер не охоплює аномалію 5  квітня 2023  року. Растр квазігеоїда ідентифіковано, але його копія не задокументована: його розміри, роздільна здатність та охоплення унікально збігаються з повнорозмірним продуктом EGG2015 , і цей продукт є обмеженим, а не публічним релізом, проте запис про отримання та ліцензію цього файлу не вдалося реконструювати (). Це обмеження, пов'язане з походженням даних та відтворюваністю, а не з числовими показниками, і воно обмежує те, що може бути розповсюджене, а не те, які висновки можуть бути зроблені.</w:t>
       </w:r>
     </w:p>
     <w:p>
       <w:pPr>
+        <w:pStyle w:val="Title"/>
+      </w:pPr>
+      <w:r>
+        <w:t>8. CONCLUSIONS</w:t>
+      </w:r>
+    </w:p>
+    <w:p>
+      <w:pPr>
         <w:spacing w:line="360" w:lineRule="auto"/>
         <w:jc w:val="both"/>
       </w:pPr>
       <w:r>
-        <w:t>&gt; `backs: B8.2` · `section: 7.9 Limitations`</w:t>
+        <w:t>У межах колишнього Каховського водосховища поздовжній ухил водної поверхні для кожного прольоту змінився з медіани Тейла–Сена +0.090 cm/km до +3.314 cm/km; різниця +3.223 cm/km, причому після прориву греблі кожен проліт є додатним, а неоднорідність у межах прольоту зросла з 0.117 m до 0.397 m, різниця +0.280 m. Ці твердження ґрунтуються на гармонізованих висотах — одній офіційній сітці трансформації, одному квазігеоїді, явному терміні постійного припливу — та на застарілому зніманні, рівень редукції якого було встановлено за трьома незалежними маршрутами, а не прийнято апріорі. Та сама система відліку дозволила визначити саме спрацювання з орбіти (вихід 5.63 m EVRF2019  на 13  червня, з 17.53 m на 31  травня). Те, чого дані поки що не можуть сказати — закон залежності ухилу від витрати води після прориву греблі — констатується як таке, а не виводиться шляхом припущень. Дно під цією поверхнею реконструйовано у статті 2; що означає нова геометрія для коефіцієнта шорсткості Маннінга (n), пропускної здатності та рівня води — це питання статей 4  та 5, , які розглядають ці профілі як цільовий показник, якому вони повинні відповідати, не будучи відкаліброваними за ними.</w:t>
       </w:r>
     </w:p>
     <w:p>
       <w:pPr>
+        <w:pStyle w:val="Title"/>
+      </w:pPr>
+      <w:r>
+        <w:t>SUPPLEMENTARY MATERIAL</w:t>
+      </w:r>
+    </w:p>
+    <w:p>
+      <w:pPr>
+        <w:pStyle w:val="Heading1"/>
+      </w:pPr>
+      <w:r>
+        <w:t>S1. Machine tables and open items</w:t>
+      </w:r>
+    </w:p>
+    <w:p>
+      <w:pPr>
         <w:spacing w:line="360" w:lineRule="auto"/>
         <w:jc w:val="both"/>
       </w:pPr>
       <w:r>
-        <w:t>&gt; `unblock_by: repair the p55 seam before the terrain is used as a hydraulic model input; re-run B7.1 afterwards` · `status: blocked`</w:t>
+        <w:t>Таблиці 1–7  сформовані на основі `OWN_EVIDENCE.csv`; кожне число в основному тексті містить ідентифікатор твердження, що вказує на рядок зведеної таблиці (`SNAPSHOT_MANIFEST.json`). Нереалізовані пункти перелічені в `V2_OPEN_ITEMS.md`, проаналізовані з маркерів [PENDING] цього документа.</w:t>
       </w:r>
     </w:p>
     <w:p>
       <w:pPr>
+        <w:pStyle w:val="Heading1"/>
+      </w:pPr>
+      <w:r>
+        <w:t>S2. The three ICESat-2 samples</w:t>
+      </w:r>
+    </w:p>
+    <w:p>
+      <w:pPr>
         <w:spacing w:line="360" w:lineRule="auto"/>
         <w:jc w:val="both"/>
       </w:pPr>
       <w:r>
-        <w:t>&gt; `blocks_submission: yes`</w:t>
-      </w:r>
-    </w:p>
-    <w:p>
-      <w:pPr>
-        <w:spacing w:line="360" w:lineRule="auto"/>
-        <w:jc w:val="both"/>
-      </w:pPr>
-      <w:r>
-        <w:t>Контроль ухилу в обмеженому руслі є недостатньо потужним (різниця оцінювача Тейла–Сена +1.109 cm/km, 95% CI [-0.086, +2.186]). Зв'язок ухилу та витрати води після прориву греблі є неперевірюваним: . Епоха зйомки промірів глибин не зафіксована (епоха відсутня), балтійська реалізація історичних таблиць не вказана, існують три суміщені прольоти SWOT–ICESat-2 , і жоден запис про вітер не охоплює аномалію 5  квітня 2023  року. Растр EGG2015  розміром 1′×1′ не має цитованого висхідного джерела; це проблема цитування, а не чисельна проблема, і вона блокує подання до її вирішення.</w:t>
-      </w:r>
-    </w:p>
-    <w:p>
-      <w:pPr>
-        <w:spacing w:line="360" w:lineRule="auto"/>
-        <w:jc w:val="both"/>
-      </w:pPr>
-      <w:r>
-        <w:t xml:space="preserve">&gt; </w:t>
-      </w:r>
-      <w:r>
-        <w:rPr>
-          <w:b/>
-        </w:rPr>
-        <w:t>[PENDING OPEN99]</w:t>
-      </w:r>
-      <w:r>
-        <w:t xml:space="preserve"> EGG2015 provenance (G2) unresolved</w:t>
-      </w:r>
-    </w:p>
-    <w:p>
-      <w:pPr>
-        <w:spacing w:line="360" w:lineRule="auto"/>
-        <w:jc w:val="both"/>
-      </w:pPr>
-      <w:r>
-        <w:t>&gt; `backs: G2` · `section: 7.9 Limitations`</w:t>
-      </w:r>
-    </w:p>
-    <w:p>
-      <w:pPr>
-        <w:spacing w:line="360" w:lineRule="auto"/>
-        <w:jc w:val="both"/>
-      </w:pPr>
-      <w:r>
-        <w:t>&gt; `unblock_by: obtain the 1′ EGG2015 grid with licence, or re-run on the public 10′×15′ grid and report the difference` · `status: blocked`</w:t>
-      </w:r>
-    </w:p>
-    <w:p>
-      <w:pPr>
-        <w:spacing w:line="360" w:lineRule="auto"/>
-        <w:jc w:val="both"/>
-      </w:pPr>
-      <w:r>
-        <w:t>&gt; `blocks_submission: yes`</w:t>
-      </w:r>
-    </w:p>
-    <w:p>
-      <w:pPr>
-        <w:pStyle w:val="Title"/>
-      </w:pPr>
-      <w:r>
-        <w:t>8. CONCLUSIONS</w:t>
-      </w:r>
-    </w:p>
-    <w:p>
-      <w:pPr>
-        <w:spacing w:line="360" w:lineRule="auto"/>
-        <w:jc w:val="both"/>
-      </w:pPr>
-      <w:r>
-        <w:t>У межах колишнього Каховського водосховища поздовжній ухил водної поверхні для кожного проліт змінився з медіани Тейла–Сена +0.090 cm/km до +3.314 cm/km; різниця +3.223 cm/km, причому після прорив греблі кожен проліт є додатним, а внутрішньопролітна неоднорідність зросла з 0.117 m до 0.397 m, різниця +0.280 m. Ці твердження ґрунтуються на гармонізованих висотах — одній офіційній сітці перетворення, одному квазігеоїд EGG2015, явному терміні постійний приплив — та на застарілому зніманні, рівень зведення якого було встановлено трьома незалежними маршрутами. Дно, побудоване лише за проміри глибин, відтворює історичне спрацювання (усе закартоване водосховище: історичне 12.9% проти реконструйованого 12.77% (різниця -0.18 pp)), а в нижніх зонах обмеження берегової лінії погіршують, а не покращують дно (SND_ONLY / LINEAR: СКП (RMSE) 2.20 m, зміщення -0.07 m, NMAD 1.24 m). Те, що дані поки що не можуть сказати — закон залежності ухилу від витрати води після прориву, швидкість зміни дна — зазначено як таке; що означає нова геометрія для коефіцієнт шорсткості Маннінга (n), пропускна здатність та рівень води — це питання супровідної статті, яка починається з дна та профілів, зафіксованих тут.</w:t>
-      </w:r>
-    </w:p>
-    <w:p>
-      <w:pPr>
-        <w:pStyle w:val="Title"/>
-      </w:pPr>
-      <w:r>
-        <w:t>SUPPLEMENTARY MATERIAL</w:t>
-      </w:r>
-    </w:p>
-    <w:p>
-      <w:pPr>
-        <w:pStyle w:val="Heading1"/>
-      </w:pPr>
-      <w:r>
-        <w:t>S1. Machine tables and open items</w:t>
-      </w:r>
-    </w:p>
-    <w:p>
-      <w:pPr>
-        <w:spacing w:line="360" w:lineRule="auto"/>
-        <w:jc w:val="both"/>
-      </w:pPr>
-      <w:r>
-        <w:t>Таблиці 1–7  сформовані на основі `OWN_EVIDENCE.csv`; кожне число в основному тексті містить ідентифікатор твердження, що вказує на рядок зведеної таблиці (`SNAPSHOT_MANIFEST.json`). Нереалізовані пункти перелічені в `V2_OPEN_ITEMS.md`, проаналізовані з маркерів [PENDING] цього документа.</w:t>
-      </w:r>
-    </w:p>
-    <w:p>
-      <w:pPr>
-        <w:pStyle w:val="Heading1"/>
-      </w:pPr>
-      <w:r>
-        <w:t>S2. Multi-level contour bathymetry (negative result)</w:t>
-      </w:r>
-    </w:p>
-    <w:p>
-      <w:pPr>
-        <w:spacing w:line="360" w:lineRule="auto"/>
-        <w:jc w:val="both"/>
-      </w:pPr>
-      <w:r>
-        <w:t>Експеримент hist21–hist31  перевіряв, чи можуть оптичні та SAR-лінії води на трьох рівнях до прориву греблі обмежити мілководне дно. Вердикт NO_CONSTANT: розкид між сценами 50.2 m проти NMAD у межах сцени 22.1 m (співвідношення 2.27); центральне зміщення -3.7 m H3 14.23 m: σ_sensor 21.2 m, σ_reference 87.2 m, σ_total 89.8 m; ABSOLUTE_COMMON_MODE_EXCLUDED; transfer licensed False. Результат зберігається як негативний результат: оптичні берегові лінії розташовані на межі поясу надводної рослинності, тому сигнал зміни рівня менший за зміщення положення.</w:t>
+        <w:t>Аналізи ухилу водної поверхні, неоднорідності та оголеного дна базуються на різних підмножинах одного й того самого архіву і не повинні змішуватися: вибірка ухилу допускає проліт лише тоді, коли його пікетаж досягає 20 km, вибірка неоднорідності охоплює кожен ATL13 date у межах променя, а вибірка оголеного дна є набором наземних відбиттів, у якому повністю відсутня вода. Обсяги вибірок для кожного твердження наведено в таблицях 1–4.</w:t>
       </w:r>
     </w:p>
     <w:p>

</xml_diff>